<commit_message>
Update hero photo/copy, add Ayni.pe project, favicon, and project description tweaks
- Swap hero photo and rewrite intro copy to sound less generic
- Remove subtitle lines under Projects/Skills sections per feedback
- Update ERP Goyo, SIMATV, Nova Smart Web/App descriptions
- Add Ayni.pe (marketplace built for UNTELS admin fair) with 11 screenshots
- Add EP monogram favicon
- Lazy-load carousel slides only once visited; skip carousel markup
  entirely for projects with no images yet

Co-Authored-By: Claude Sonnet 5 <noreply@anthropic.com>
</commit_message>
<xml_diff>
--- a/Edward Pittman - CV.docx
+++ b/Edward Pittman - CV.docx
@@ -40,10 +40,7 @@
         </w:r>
       </w:hyperlink>
       <w:r>
-        <w:t>· +</w:t>
-      </w:r>
-      <w:r>
-        <w:t>51 907377938 · epittman341@gmail.com</w:t>
+        <w:t>· +51 907377938 · epittman341@gmail.com</w:t>
       </w:r>
       <w:r>
         <w:rPr>
@@ -250,761 +247,302 @@
     </w:p>
     <w:p>
       <w:pPr>
+        <w:keepNext/>
         <w:tabs>
           <w:tab w:val="right" w:pos="11198"/>
         </w:tabs>
         <w:spacing w:after="1" w:line="258" w:lineRule="auto"/>
         <w:ind w:left="0" w:right="0" w:firstLine="0"/>
-        <w:jc w:val="left"/>
+        <w:rPr>
+          <w:szCs w:val="22"/>
+        </w:rPr>
       </w:pPr>
       <w:r>
         <w:rPr>
           <w:b/>
-        </w:rPr>
-        <w:t>HERRAMIENTA DE AUTOMATIZACIÓN CLI PARA GIT &amp; GITHUB</w:t>
-      </w:r>
-      <w:r>
-        <w:rPr>
-          <w:b/>
+          <w:szCs w:val="22"/>
+        </w:rPr>
+        <w:t xml:space="preserve">NOVA SMART </w:t>
+        <w:tab/>
+        <w:t xml:space="preserve">Lima, Perú</w:t>
+      </w:r>
+      <w:r>
+        <w:rPr>
+          <w:i/>
+          <w:szCs w:val="22"/>
         </w:rPr>
         <w:t xml:space="preserve"> </w:t>
       </w:r>
-      <w:r>
-        <w:rPr>
-          <w:b/>
-        </w:rPr>
-        <w:tab/>
-        <w:t>Lima, Perú</w:t>
-      </w:r>
-      <w:r>
-        <w:rPr>
-          <w:i/>
-        </w:rPr>
-        <w:t xml:space="preserve"> </w:t>
-      </w:r>
-    </w:p>
-    <w:p>
-      <w:pPr>
+    </w:p>
+    <w:p>
+      <w:pPr>
+        <w:keepNext/>
         <w:tabs>
           <w:tab w:val="right" w:pos="11198"/>
         </w:tabs>
         <w:spacing w:after="113"/>
         <w:ind w:left="0" w:right="0" w:firstLine="0"/>
-        <w:jc w:val="left"/>
-        <w:rPr>
-          <w:szCs w:val="22"/>
-        </w:rPr>
-      </w:pPr>
-      <w:r>
-        <w:rPr>
-          <w:szCs w:val="22"/>
-        </w:rPr>
-        <w:t xml:space="preserve">Desarrollador </w:t>
-      </w:r>
-      <w:proofErr w:type="spellStart"/>
-      <w:r>
-        <w:rPr>
-          <w:szCs w:val="22"/>
-        </w:rPr>
-        <w:t>FullStack</w:t>
-      </w:r>
-      <w:proofErr w:type="spellEnd"/>
-      <w:r>
-        <w:rPr>
-          <w:szCs w:val="22"/>
-        </w:rPr>
-        <w:t xml:space="preserve"> </w:t>
-      </w:r>
-      <w:r>
-        <w:rPr>
-          <w:szCs w:val="22"/>
-        </w:rPr>
+        <w:rPr>
+          <w:szCs w:val="22"/>
+        </w:rPr>
+      </w:pPr>
+      <w:r>
+        <w:rPr>
+          <w:szCs w:val="22"/>
+        </w:rPr>
+        <w:t xml:space="preserve">Desarrollador FullStack </w:t>
         <w:tab/>
       </w:r>
-      <w:proofErr w:type="gramStart"/>
       <w:r>
         <w:rPr>
           <w:i/>
-          <w:szCs w:val="22"/>
-        </w:rPr>
-        <w:t>Abril</w:t>
-      </w:r>
-      <w:proofErr w:type="gramEnd"/>
-      <w:r>
-        <w:rPr>
-          <w:i/>
-          <w:szCs w:val="22"/>
-        </w:rPr>
-        <w:t xml:space="preserve"> </w:t>
-      </w:r>
-      <w:r>
-        <w:rPr>
-          <w:i/>
-          <w:szCs w:val="22"/>
-        </w:rPr>
-        <w:t>2026</w:t>
-      </w:r>
-      <w:r>
-        <w:rPr>
-          <w:i/>
-          <w:szCs w:val="22"/>
-        </w:rPr>
-        <w:t xml:space="preserve"> </w:t>
-      </w:r>
-      <w:r>
-        <w:rPr>
-          <w:b/>
-          <w:i/>
-          <w:szCs w:val="22"/>
-        </w:rPr>
-        <w:t xml:space="preserve">  </w:t>
-      </w:r>
-    </w:p>
-    <w:p>
-      <w:pPr>
-        <w:pStyle w:val="NormalWeb"/>
+          <w:iCs/>
+          <w:szCs w:val="22"/>
+        </w:rPr>
+        <w:t xml:space="preserve">Julio 2026 – Actualidad</w:t>
+      </w:r>
+    </w:p>
+    <w:p>
+      <w:pPr>
+        <w:keepLines/>
         <w:numPr>
           <w:ilvl w:val="0"/>
-          <w:numId w:val="3"/>
+          <w:numId w:val="1"/>
         </w:numPr>
-        <w:jc w:val="both"/>
-        <w:rPr>
-          <w:rFonts w:ascii="Calibri" w:hAnsi="Calibri" w:cs="Calibri"/>
-          <w:sz w:val="22"/>
-          <w:szCs w:val="22"/>
-        </w:rPr>
-      </w:pPr>
-      <w:r>
-        <w:rPr>
-          <w:rFonts w:ascii="Calibri" w:hAnsi="Calibri" w:cs="Calibri"/>
-          <w:sz w:val="22"/>
-          <w:szCs w:val="22"/>
-        </w:rPr>
-        <w:t xml:space="preserve">Diseñé y desarrollé una herramienta de interfaz de línea de comandos (CLI) multiplataforma nativa para Node.js, automatizando de extremo a extremo el ciclo de vida de repositorios Git (inicialización, </w:t>
-      </w:r>
-      <w:proofErr w:type="spellStart"/>
-      <w:r>
-        <w:rPr>
-          <w:rFonts w:ascii="Calibri" w:hAnsi="Calibri" w:cs="Calibri"/>
-          <w:sz w:val="22"/>
-          <w:szCs w:val="22"/>
-        </w:rPr>
-        <w:t>staging</w:t>
-      </w:r>
-      <w:proofErr w:type="spellEnd"/>
-      <w:r>
-        <w:rPr>
-          <w:rFonts w:ascii="Calibri" w:hAnsi="Calibri" w:cs="Calibri"/>
-          <w:sz w:val="22"/>
-          <w:szCs w:val="22"/>
-        </w:rPr>
-        <w:t xml:space="preserve">, </w:t>
-      </w:r>
-      <w:proofErr w:type="spellStart"/>
-      <w:r>
-        <w:rPr>
-          <w:rFonts w:ascii="Calibri" w:hAnsi="Calibri" w:cs="Calibri"/>
-          <w:sz w:val="22"/>
-          <w:szCs w:val="22"/>
-        </w:rPr>
-        <w:t>commits</w:t>
-      </w:r>
-      <w:proofErr w:type="spellEnd"/>
-      <w:r>
-        <w:rPr>
-          <w:rFonts w:ascii="Calibri" w:hAnsi="Calibri" w:cs="Calibri"/>
-          <w:sz w:val="22"/>
-          <w:szCs w:val="22"/>
-        </w:rPr>
-        <w:t xml:space="preserve"> y sincronización remota)</w:t>
-      </w:r>
-    </w:p>
-    <w:p>
-      <w:pPr>
-        <w:pStyle w:val="NormalWeb"/>
+        <w:ind w:right="842" w:hanging="360"/>
+        <w:rPr>
+          <w:szCs w:val="22"/>
+        </w:rPr>
+      </w:pPr>
+      <w:r>
+        <w:rPr>
+          <w:b/>
+          <w:szCs w:val="22"/>
+        </w:rPr>
+        <w:t xml:space="preserve">Sitio web corporativo: </w:t>
+      </w:r>
+      <w:r>
+        <w:rPr>
+          <w:szCs w:val="22"/>
+        </w:rPr>
+        <w:t xml:space="preserve">catálogo interactivo de 37 planes de Fibra Óptica FTTH/HFC (1Play/2Play/3Play) para Claro, con carrusel, galería de equipo, formulario de contacto comercial y bolsa de trabajo con postulación; construido con Astro, TypeScript y View Transitions. </w:t>
+      </w:r>
+    </w:p>
+    <w:p>
+      <w:pPr>
         <w:numPr>
           <w:ilvl w:val="0"/>
-          <w:numId w:val="3"/>
+          <w:numId w:val="1"/>
         </w:numPr>
-        <w:jc w:val="both"/>
-        <w:rPr>
-          <w:rFonts w:ascii="Calibri" w:hAnsi="Calibri" w:cs="Calibri"/>
-          <w:sz w:val="22"/>
-          <w:szCs w:val="22"/>
-        </w:rPr>
-      </w:pPr>
-      <w:r>
-        <w:rPr>
-          <w:rFonts w:ascii="Calibri" w:hAnsi="Calibri" w:cs="Calibri"/>
-          <w:sz w:val="22"/>
-          <w:szCs w:val="22"/>
-        </w:rPr>
-        <w:t xml:space="preserve">Implementé flujos lógicos dinámicos e interactivos en terminal utilizando </w:t>
-      </w:r>
-      <w:proofErr w:type="spellStart"/>
-      <w:r>
-        <w:rPr>
-          <w:rFonts w:ascii="Calibri" w:hAnsi="Calibri" w:cs="Calibri"/>
-          <w:sz w:val="22"/>
-          <w:szCs w:val="22"/>
-        </w:rPr>
-        <w:t>readline-sync</w:t>
-      </w:r>
-      <w:proofErr w:type="spellEnd"/>
-      <w:r>
-        <w:rPr>
-          <w:rFonts w:ascii="Calibri" w:hAnsi="Calibri" w:cs="Calibri"/>
-          <w:sz w:val="22"/>
-          <w:szCs w:val="22"/>
-        </w:rPr>
-        <w:t xml:space="preserve"> y manejo de flujos de sistema (</w:t>
-      </w:r>
-      <w:proofErr w:type="spellStart"/>
-      <w:r>
-        <w:rPr>
-          <w:rFonts w:ascii="Calibri" w:hAnsi="Calibri" w:cs="Calibri"/>
-          <w:sz w:val="22"/>
-          <w:szCs w:val="22"/>
-        </w:rPr>
-        <w:t>child_process</w:t>
-      </w:r>
-      <w:proofErr w:type="spellEnd"/>
-      <w:r>
-        <w:rPr>
-          <w:rFonts w:ascii="Calibri" w:hAnsi="Calibri" w:cs="Calibri"/>
-          <w:sz w:val="22"/>
-          <w:szCs w:val="22"/>
-        </w:rPr>
-        <w:t>), reduciendo drásticamente el tiempo de configuración inicial de proyectos de software</w:t>
-      </w:r>
-      <w:r>
-        <w:rPr>
-          <w:rFonts w:ascii="Calibri" w:hAnsi="Calibri" w:cs="Calibri"/>
-          <w:sz w:val="22"/>
-          <w:szCs w:val="22"/>
-        </w:rPr>
-        <w:t>.</w:t>
-      </w:r>
-    </w:p>
-    <w:p>
-      <w:pPr>
-        <w:pStyle w:val="NormalWeb"/>
+        <w:ind w:right="842" w:hanging="360"/>
+        <w:rPr>
+          <w:szCs w:val="22"/>
+        </w:rPr>
+      </w:pPr>
+      <w:r>
+        <w:rPr>
+          <w:b/>
+          <w:szCs w:val="22"/>
+        </w:rPr>
+        <w:t xml:space="preserve">App móvil empresarial: </w:t>
+      </w:r>
+      <w:r>
+        <w:rPr>
+          <w:szCs w:val="22"/>
+        </w:rPr>
+        <w:t xml:space="preserve">sistema con 6 roles y permisos granulares por módulo; ventas, instalaciones, almacén (stock, entregas, checklists) y auditorías con firma digital SVG y reportes en PDF; asistencia con reconocimiento facial. Backend en Supabase (PostgreSQL, RLS, 30+ tablas) con Expo/React Native y TypeScript. </w:t>
+      </w:r>
+    </w:p>
+    <w:p>
+      <w:pPr>
         <w:numPr>
           <w:ilvl w:val="0"/>
-          <w:numId w:val="3"/>
+          <w:numId w:val="1"/>
         </w:numPr>
-        <w:jc w:val="both"/>
-        <w:rPr>
-          <w:rFonts w:ascii="Calibri" w:hAnsi="Calibri" w:cs="Calibri"/>
-          <w:sz w:val="22"/>
-          <w:szCs w:val="22"/>
-        </w:rPr>
-      </w:pPr>
-      <w:r>
-        <w:rPr>
-          <w:rFonts w:ascii="Calibri" w:hAnsi="Calibri" w:cs="Calibri"/>
-          <w:sz w:val="22"/>
-          <w:szCs w:val="22"/>
-        </w:rPr>
-        <w:t>Integré automatización avanzada mediante la API/CLI de GitHub (</w:t>
-      </w:r>
-      <w:proofErr w:type="spellStart"/>
-      <w:r>
-        <w:rPr>
-          <w:rFonts w:ascii="Calibri" w:hAnsi="Calibri" w:cs="Calibri"/>
-          <w:sz w:val="22"/>
-          <w:szCs w:val="22"/>
-        </w:rPr>
-        <w:t>gh</w:t>
-      </w:r>
-      <w:proofErr w:type="spellEnd"/>
-      <w:r>
-        <w:rPr>
-          <w:rFonts w:ascii="Calibri" w:hAnsi="Calibri" w:cs="Calibri"/>
-          <w:sz w:val="22"/>
-          <w:szCs w:val="22"/>
-        </w:rPr>
-        <w:t>), permitiendo la autenticación interactiva de usuarios, detección automatizada de dependencias del sistema operativo y aprovisionamiento de repositorios públicos/privados en la nube en un solo paso</w:t>
-      </w:r>
-      <w:r>
-        <w:rPr>
-          <w:rFonts w:ascii="Calibri" w:hAnsi="Calibri" w:cs="Calibri"/>
-          <w:sz w:val="22"/>
-          <w:szCs w:val="22"/>
-        </w:rPr>
-        <w:t>.</w:t>
-      </w:r>
-    </w:p>
-    <w:p>
-      <w:pPr>
-        <w:pStyle w:val="NormalWeb"/>
+        <w:ind w:right="842" w:hanging="360"/>
+        <w:rPr>
+          <w:szCs w:val="22"/>
+        </w:rPr>
+      </w:pPr>
+      <w:r>
+        <w:rPr>
+          <w:b/>
+          <w:szCs w:val="22"/>
+        </w:rPr>
+        <w:t xml:space="preserve">Bandeja de WhatsApp: </w:t>
+      </w:r>
+      <w:r>
+        <w:rPr>
+          <w:szCs w:val="22"/>
+        </w:rPr>
+        <w:t xml:space="preserve">panel con dashboard de métricas, chat en tiempo real y editor de plantillas, conectado a Supabase Edge Functions. </w:t>
+      </w:r>
+    </w:p>
+    <w:p>
+      <w:pPr>
         <w:numPr>
           <w:ilvl w:val="0"/>
-          <w:numId w:val="3"/>
+          <w:numId w:val="1"/>
         </w:numPr>
-        <w:jc w:val="both"/>
-        <w:rPr>
-          <w:rFonts w:ascii="Calibri" w:hAnsi="Calibri" w:cs="Calibri"/>
-          <w:sz w:val="22"/>
-          <w:szCs w:val="22"/>
-        </w:rPr>
-      </w:pPr>
-      <w:r>
-        <w:rPr>
-          <w:rFonts w:ascii="Calibri" w:hAnsi="Calibri" w:cs="Calibri"/>
-          <w:sz w:val="22"/>
-          <w:szCs w:val="22"/>
-        </w:rPr>
-        <w:t>Configuré un sistema de ejecución de doble comando en el manifiesto (</w:t>
-      </w:r>
-      <w:proofErr w:type="spellStart"/>
-      <w:r>
-        <w:rPr>
-          <w:rFonts w:ascii="Calibri" w:hAnsi="Calibri" w:cs="Calibri"/>
-          <w:sz w:val="22"/>
-          <w:szCs w:val="22"/>
-        </w:rPr>
-        <w:t>bin</w:t>
-      </w:r>
-      <w:proofErr w:type="spellEnd"/>
-      <w:r>
-        <w:rPr>
-          <w:rFonts w:ascii="Calibri" w:hAnsi="Calibri" w:cs="Calibri"/>
-          <w:sz w:val="22"/>
-          <w:szCs w:val="22"/>
-        </w:rPr>
-        <w:t xml:space="preserve"> de </w:t>
-      </w:r>
-      <w:proofErr w:type="spellStart"/>
-      <w:r>
-        <w:rPr>
-          <w:rFonts w:ascii="Calibri" w:hAnsi="Calibri" w:cs="Calibri"/>
-          <w:sz w:val="22"/>
-          <w:szCs w:val="22"/>
-        </w:rPr>
-        <w:t>npm</w:t>
-      </w:r>
-      <w:proofErr w:type="spellEnd"/>
-      <w:r>
-        <w:rPr>
-          <w:rFonts w:ascii="Calibri" w:hAnsi="Calibri" w:cs="Calibri"/>
-          <w:sz w:val="22"/>
-          <w:szCs w:val="22"/>
-        </w:rPr>
-        <w:t>) para habilitar alias contextuales (gracias-edward / actualiza-edward), optimizando flujos de trabajo rápidos de actualización (</w:t>
-      </w:r>
-      <w:proofErr w:type="spellStart"/>
-      <w:r>
-        <w:rPr>
-          <w:rFonts w:ascii="Calibri" w:hAnsi="Calibri" w:cs="Calibri"/>
-          <w:i/>
-          <w:iCs/>
-          <w:sz w:val="22"/>
-          <w:szCs w:val="22"/>
-        </w:rPr>
-        <w:t>quick-push</w:t>
-      </w:r>
-      <w:proofErr w:type="spellEnd"/>
-      <w:r>
-        <w:rPr>
-          <w:rFonts w:ascii="Calibri" w:hAnsi="Calibri" w:cs="Calibri"/>
-          <w:sz w:val="22"/>
-          <w:szCs w:val="22"/>
-        </w:rPr>
-        <w:t>)</w:t>
-      </w:r>
-      <w:r>
-        <w:rPr>
-          <w:rFonts w:ascii="Calibri" w:hAnsi="Calibri" w:cs="Calibri"/>
-          <w:sz w:val="22"/>
-          <w:szCs w:val="22"/>
-        </w:rPr>
-        <w:t>.</w:t>
-      </w:r>
-    </w:p>
-    <w:p>
-      <w:pPr>
+        <w:ind w:right="842" w:hanging="360"/>
+        <w:rPr>
+          <w:szCs w:val="22"/>
+        </w:rPr>
+      </w:pPr>
+      <w:r>
+        <w:rPr>
+          <w:b/>
+          <w:szCs w:val="22"/>
+        </w:rPr>
+        <w:t xml:space="preserve">Automatización de WhatsApp: </w:t>
+      </w:r>
+      <w:r>
+        <w:rPr>
+          <w:szCs w:val="22"/>
+        </w:rPr>
+        <w:t xml:space="preserve">bot construido sobre la API de Meta (WhatsApp Business Cloud API) con Python y TypeScript para agilizar la atención al cliente. </w:t>
+      </w:r>
+    </w:p>
+    <w:p>
+      <w:pPr>
+        <w:numPr>
+          <w:ilvl w:val="0"/>
+          <w:numId w:val="1"/>
+        </w:numPr>
+        <w:ind w:right="842" w:hanging="360"/>
+        <w:rPr>
+          <w:szCs w:val="22"/>
+        </w:rPr>
+      </w:pPr>
+      <w:r>
+        <w:rPr>
+          <w:b/>
+          <w:szCs w:val="22"/>
+        </w:rPr>
+        <w:t xml:space="preserve">WhatsApp Line Extractor: </w:t>
+      </w:r>
+      <w:r>
+        <w:rPr>
+          <w:szCs w:val="22"/>
+        </w:rPr>
+        <w:t xml:space="preserve">extensión de Chrome con OCR (Tesseract.js) para agilizar una tarea operativa diaria. </w:t>
+      </w:r>
+    </w:p>
+    <w:p>
+      <w:pPr>
+        <w:spacing w:after="0" w:line="259" w:lineRule="auto"/>
+        <w:ind w:right="0"/>
+        <w:rPr>
+          <w:szCs w:val="22"/>
+        </w:rPr>
+      </w:pPr>
+    </w:p>
+    <w:p>
+      <w:pPr>
+        <w:keepNext/>
         <w:tabs>
           <w:tab w:val="right" w:pos="11198"/>
         </w:tabs>
         <w:spacing w:after="1" w:line="258" w:lineRule="auto"/>
         <w:ind w:left="0" w:right="0" w:firstLine="0"/>
-        <w:jc w:val="left"/>
+        <w:rPr>
+          <w:szCs w:val="22"/>
+        </w:rPr>
       </w:pPr>
       <w:r>
         <w:rPr>
           <w:b/>
-        </w:rPr>
-        <w:t xml:space="preserve">SIMATV </w:t>
-      </w:r>
-      <w:r>
-        <w:rPr>
-          <w:b/>
-        </w:rPr>
+          <w:szCs w:val="22"/>
+        </w:rPr>
+        <w:t xml:space="preserve">HERRAMIENTA DE AUTOMATIZACIÓN CLI PARA GIT &amp; GITHUB </w:t>
         <w:tab/>
-        <w:t>Lima, Perú</w:t>
+        <w:t xml:space="preserve">Lima, Perú</w:t>
       </w:r>
       <w:r>
         <w:rPr>
           <w:i/>
+          <w:szCs w:val="22"/>
         </w:rPr>
         <w:t xml:space="preserve"> </w:t>
       </w:r>
     </w:p>
     <w:p>
       <w:pPr>
+        <w:keepNext/>
         <w:tabs>
           <w:tab w:val="right" w:pos="11198"/>
         </w:tabs>
         <w:spacing w:after="113"/>
         <w:ind w:left="0" w:right="0" w:firstLine="0"/>
-        <w:jc w:val="left"/>
-        <w:rPr>
-          <w:szCs w:val="22"/>
-        </w:rPr>
-      </w:pPr>
-      <w:r>
-        <w:rPr>
-          <w:szCs w:val="22"/>
-        </w:rPr>
-        <w:t xml:space="preserve">Desarrollador </w:t>
-      </w:r>
-      <w:proofErr w:type="spellStart"/>
-      <w:r>
-        <w:rPr>
-          <w:szCs w:val="22"/>
-        </w:rPr>
-        <w:t>FullStack</w:t>
-      </w:r>
-      <w:proofErr w:type="spellEnd"/>
-      <w:r>
-        <w:rPr>
-          <w:szCs w:val="22"/>
-        </w:rPr>
-        <w:t xml:space="preserve"> </w:t>
-      </w:r>
-      <w:r>
-        <w:rPr>
-          <w:szCs w:val="22"/>
-        </w:rPr>
+        <w:rPr>
+          <w:szCs w:val="22"/>
+        </w:rPr>
+      </w:pPr>
+      <w:r>
+        <w:rPr>
+          <w:szCs w:val="22"/>
+        </w:rPr>
+        <w:t xml:space="preserve">Desarrollador FullStack </w:t>
         <w:tab/>
       </w:r>
-      <w:proofErr w:type="gramStart"/>
       <w:r>
         <w:rPr>
           <w:i/>
-          <w:szCs w:val="22"/>
-        </w:rPr>
-        <w:t>Marzo</w:t>
-      </w:r>
-      <w:proofErr w:type="gramEnd"/>
-      <w:r>
-        <w:rPr>
-          <w:i/>
-          <w:szCs w:val="22"/>
-        </w:rPr>
-        <w:t xml:space="preserve"> 2026 – Actualidad</w:t>
-      </w:r>
-      <w:r>
-        <w:rPr>
-          <w:b/>
-          <w:i/>
-          <w:szCs w:val="22"/>
-        </w:rPr>
-        <w:t xml:space="preserve">  </w:t>
-      </w:r>
-    </w:p>
-    <w:p>
-      <w:pPr>
-        <w:pStyle w:val="NormalWeb"/>
+          <w:iCs/>
+          <w:szCs w:val="22"/>
+        </w:rPr>
+        <w:t xml:space="preserve">Abril 2026</w:t>
+      </w:r>
+    </w:p>
+    <w:p>
+      <w:pPr>
+        <w:keepLines/>
         <w:numPr>
           <w:ilvl w:val="0"/>
-          <w:numId w:val="3"/>
+          <w:numId w:val="1"/>
         </w:numPr>
-        <w:jc w:val="both"/>
-        <w:rPr>
-          <w:rFonts w:ascii="Calibri" w:hAnsi="Calibri" w:cs="Calibri"/>
-          <w:sz w:val="22"/>
-          <w:szCs w:val="22"/>
-        </w:rPr>
-      </w:pPr>
-      <w:proofErr w:type="spellStart"/>
-      <w:proofErr w:type="gramStart"/>
-      <w:r>
-        <w:rPr>
-          <w:rFonts w:ascii="Calibri" w:hAnsi="Calibri" w:cs="Calibri"/>
-          <w:sz w:val="22"/>
-          <w:szCs w:val="22"/>
-        </w:rPr>
-        <w:t>Co-desarrollé</w:t>
-      </w:r>
-      <w:proofErr w:type="spellEnd"/>
-      <w:proofErr w:type="gramEnd"/>
-      <w:r>
-        <w:rPr>
-          <w:rFonts w:ascii="Calibri" w:hAnsi="Calibri" w:cs="Calibri"/>
-          <w:sz w:val="22"/>
-          <w:szCs w:val="22"/>
-        </w:rPr>
-        <w:t xml:space="preserve"> para la empresa de telecomunicaciones SIMA una aplicación de IPTV optimizada para Smart </w:t>
-      </w:r>
-      <w:proofErr w:type="spellStart"/>
-      <w:r>
-        <w:rPr>
-          <w:rFonts w:ascii="Calibri" w:hAnsi="Calibri" w:cs="Calibri"/>
-          <w:sz w:val="22"/>
-          <w:szCs w:val="22"/>
-        </w:rPr>
-        <w:t>TVs</w:t>
-      </w:r>
-      <w:proofErr w:type="spellEnd"/>
-      <w:r>
-        <w:rPr>
-          <w:rFonts w:ascii="Calibri" w:hAnsi="Calibri" w:cs="Calibri"/>
-          <w:sz w:val="22"/>
-          <w:szCs w:val="22"/>
-        </w:rPr>
-        <w:t xml:space="preserve"> y Android TV, logrando el </w:t>
-      </w:r>
-      <w:proofErr w:type="spellStart"/>
-      <w:r>
-        <w:rPr>
-          <w:rFonts w:ascii="Calibri" w:hAnsi="Calibri" w:cs="Calibri"/>
-          <w:sz w:val="22"/>
-          <w:szCs w:val="22"/>
-        </w:rPr>
-        <w:t>streaming</w:t>
-      </w:r>
-      <w:proofErr w:type="spellEnd"/>
-      <w:r>
-        <w:rPr>
-          <w:rFonts w:ascii="Calibri" w:hAnsi="Calibri" w:cs="Calibri"/>
-          <w:sz w:val="22"/>
-          <w:szCs w:val="22"/>
-        </w:rPr>
-        <w:t xml:space="preserve"> de canales en vivo con alta disponibilidad y rendimiento fluido</w:t>
-      </w:r>
-    </w:p>
-    <w:p>
-      <w:pPr>
-        <w:pStyle w:val="NormalWeb"/>
+        <w:ind w:right="842" w:hanging="360"/>
+        <w:rPr>
+          <w:szCs w:val="22"/>
+        </w:rPr>
+      </w:pPr>
+      <w:r>
+        <w:rPr>
+          <w:szCs w:val="22"/>
+        </w:rPr>
+        <w:t xml:space="preserve">Diseñé una CLI multiplataforma en Node.js que automatiza el ciclo de vida de repositorios Git (init, commits, push) e integra la API/CLI de GitHub para autenticación y despliegue en un solo paso. </w:t>
+      </w:r>
+    </w:p>
+    <w:p>
+      <w:pPr>
         <w:numPr>
           <w:ilvl w:val="0"/>
-          <w:numId w:val="3"/>
+          <w:numId w:val="1"/>
         </w:numPr>
-        <w:jc w:val="both"/>
-        <w:rPr>
-          <w:rFonts w:ascii="Calibri" w:hAnsi="Calibri" w:cs="Calibri"/>
-          <w:sz w:val="22"/>
-          <w:szCs w:val="22"/>
-        </w:rPr>
-      </w:pPr>
-      <w:r>
-        <w:rPr>
-          <w:rFonts w:ascii="Calibri" w:hAnsi="Calibri" w:cs="Calibri"/>
-          <w:sz w:val="22"/>
-          <w:szCs w:val="22"/>
-        </w:rPr>
-        <w:t>Diseñé e implementé una interfaz de usuario (UI/UX) nativa para pantallas grandes, garantizando una navegación intuitiva y una experiencia fluida controlada exclusivamente mediante control remoto (D-</w:t>
-      </w:r>
-      <w:proofErr w:type="spellStart"/>
-      <w:r>
-        <w:rPr>
-          <w:rFonts w:ascii="Calibri" w:hAnsi="Calibri" w:cs="Calibri"/>
-          <w:sz w:val="22"/>
-          <w:szCs w:val="22"/>
-        </w:rPr>
-        <w:t>pad</w:t>
-      </w:r>
-      <w:proofErr w:type="spellEnd"/>
-      <w:r>
-        <w:rPr>
-          <w:rFonts w:ascii="Calibri" w:hAnsi="Calibri" w:cs="Calibri"/>
-          <w:sz w:val="22"/>
-          <w:szCs w:val="22"/>
-        </w:rPr>
-        <w:t xml:space="preserve"> </w:t>
-      </w:r>
-      <w:proofErr w:type="spellStart"/>
-      <w:r>
-        <w:rPr>
-          <w:rFonts w:ascii="Calibri" w:hAnsi="Calibri" w:cs="Calibri"/>
-          <w:sz w:val="22"/>
-          <w:szCs w:val="22"/>
-        </w:rPr>
-        <w:t>navigation</w:t>
-      </w:r>
-      <w:proofErr w:type="spellEnd"/>
-      <w:r>
-        <w:rPr>
-          <w:rFonts w:ascii="Calibri" w:hAnsi="Calibri" w:cs="Calibri"/>
-          <w:sz w:val="22"/>
-          <w:szCs w:val="22"/>
-        </w:rPr>
-        <w:t>)</w:t>
-      </w:r>
-      <w:r>
-        <w:rPr>
-          <w:rFonts w:ascii="Calibri" w:hAnsi="Calibri" w:cs="Calibri"/>
-          <w:sz w:val="22"/>
-          <w:szCs w:val="22"/>
-        </w:rPr>
-        <w:t>.</w:t>
-      </w:r>
-    </w:p>
-    <w:p>
-      <w:pPr>
-        <w:pStyle w:val="NormalWeb"/>
-        <w:numPr>
-          <w:ilvl w:val="0"/>
-          <w:numId w:val="3"/>
-        </w:numPr>
-        <w:jc w:val="both"/>
-        <w:rPr>
-          <w:rFonts w:ascii="Calibri" w:hAnsi="Calibri" w:cs="Calibri"/>
-          <w:sz w:val="22"/>
-          <w:szCs w:val="22"/>
-        </w:rPr>
-      </w:pPr>
-      <w:r>
-        <w:rPr>
-          <w:rFonts w:ascii="Calibri" w:hAnsi="Calibri" w:cs="Calibri"/>
-          <w:sz w:val="22"/>
-          <w:szCs w:val="22"/>
-        </w:rPr>
-        <w:t xml:space="preserve">Integré y optimicé protocolos de </w:t>
-      </w:r>
-      <w:proofErr w:type="spellStart"/>
-      <w:r>
-        <w:rPr>
-          <w:rFonts w:ascii="Calibri" w:hAnsi="Calibri" w:cs="Calibri"/>
-          <w:sz w:val="22"/>
-          <w:szCs w:val="22"/>
-        </w:rPr>
-        <w:t>streaming</w:t>
-      </w:r>
-      <w:proofErr w:type="spellEnd"/>
-      <w:r>
-        <w:rPr>
-          <w:rFonts w:ascii="Calibri" w:hAnsi="Calibri" w:cs="Calibri"/>
-          <w:sz w:val="22"/>
-          <w:szCs w:val="22"/>
-        </w:rPr>
-        <w:t xml:space="preserve"> de video en tiempo real (HLS/DASH), logrando una reducción significativa de la latencia y minimizando el tiempo de cambio de canal (</w:t>
-      </w:r>
-      <w:proofErr w:type="gramStart"/>
-      <w:r>
-        <w:rPr>
-          <w:rFonts w:ascii="Calibri" w:hAnsi="Calibri" w:cs="Calibri"/>
-          <w:sz w:val="22"/>
-          <w:szCs w:val="22"/>
-        </w:rPr>
-        <w:t>zapping</w:t>
-      </w:r>
-      <w:proofErr w:type="gramEnd"/>
-      <w:r>
-        <w:rPr>
-          <w:rFonts w:ascii="Calibri" w:hAnsi="Calibri" w:cs="Calibri"/>
-          <w:sz w:val="22"/>
-          <w:szCs w:val="22"/>
-        </w:rPr>
-        <w:t xml:space="preserve"> </w:t>
-      </w:r>
-      <w:proofErr w:type="gramStart"/>
-      <w:r>
-        <w:rPr>
-          <w:rFonts w:ascii="Calibri" w:hAnsi="Calibri" w:cs="Calibri"/>
-          <w:sz w:val="22"/>
-          <w:szCs w:val="22"/>
-        </w:rPr>
-        <w:t>time</w:t>
-      </w:r>
-      <w:proofErr w:type="gramEnd"/>
-      <w:r>
-        <w:rPr>
-          <w:rFonts w:ascii="Calibri" w:hAnsi="Calibri" w:cs="Calibri"/>
-          <w:sz w:val="22"/>
-          <w:szCs w:val="22"/>
-        </w:rPr>
-        <w:t>).</w:t>
-      </w:r>
-    </w:p>
-    <w:p>
-      <w:pPr>
-        <w:pStyle w:val="NormalWeb"/>
-        <w:numPr>
-          <w:ilvl w:val="0"/>
-          <w:numId w:val="3"/>
-        </w:numPr>
-        <w:jc w:val="both"/>
-        <w:rPr>
-          <w:rFonts w:ascii="Calibri" w:hAnsi="Calibri" w:cs="Calibri"/>
-          <w:sz w:val="22"/>
-          <w:szCs w:val="22"/>
-        </w:rPr>
-      </w:pPr>
-      <w:r>
-        <w:rPr>
-          <w:rFonts w:ascii="Calibri" w:hAnsi="Calibri" w:cs="Calibri"/>
-          <w:sz w:val="22"/>
-          <w:szCs w:val="22"/>
-        </w:rPr>
-        <w:t>Desarrollé la arquitectura para la gestión y carga de listas de canales, e integré la sincronización de la Guía Electrónica de Programación (EPG) para desplegar la grilla de contenidos en tiempo real</w:t>
-      </w:r>
-      <w:r>
-        <w:rPr>
-          <w:rFonts w:ascii="Calibri" w:hAnsi="Calibri" w:cs="Calibri"/>
-          <w:sz w:val="22"/>
-          <w:szCs w:val="22"/>
-        </w:rPr>
-        <w:t>.</w:t>
-      </w:r>
-    </w:p>
-    <w:p>
-      <w:pPr>
-        <w:pStyle w:val="NormalWeb"/>
-        <w:numPr>
-          <w:ilvl w:val="0"/>
-          <w:numId w:val="3"/>
-        </w:numPr>
-        <w:jc w:val="both"/>
-        <w:rPr>
-          <w:rFonts w:ascii="Calibri" w:hAnsi="Calibri" w:cs="Calibri"/>
-          <w:sz w:val="22"/>
-          <w:szCs w:val="22"/>
-        </w:rPr>
-      </w:pPr>
-      <w:r>
-        <w:rPr>
-          <w:rFonts w:ascii="Calibri" w:hAnsi="Calibri" w:cs="Calibri"/>
-          <w:sz w:val="22"/>
-          <w:szCs w:val="22"/>
-        </w:rPr>
-        <w:t>Maximicé el rendimiento y el consumo de recursos de la aplicación, garantizando una reproducción de video estable y sin interrupciones incluso en dispositivos de TV con hardware limitado</w:t>
-      </w:r>
-      <w:r>
-        <w:rPr>
-          <w:rFonts w:ascii="Calibri" w:hAnsi="Calibri" w:cs="Calibri"/>
-          <w:sz w:val="22"/>
-          <w:szCs w:val="22"/>
-        </w:rPr>
-        <w:t>.</w:t>
-      </w:r>
-    </w:p>
-    <w:p>
-      <w:pPr>
-        <w:pStyle w:val="NormalWeb"/>
-        <w:ind w:left="720"/>
-        <w:jc w:val="both"/>
-        <w:rPr>
-          <w:rFonts w:ascii="Calibri" w:hAnsi="Calibri" w:cs="Calibri"/>
-          <w:sz w:val="22"/>
-          <w:szCs w:val="22"/>
-        </w:rPr>
-      </w:pPr>
-    </w:p>
-    <w:p>
-      <w:pPr>
+        <w:ind w:right="842" w:hanging="360"/>
+        <w:rPr>
+          <w:szCs w:val="22"/>
+        </w:rPr>
+      </w:pPr>
+      <w:r>
+        <w:rPr>
+          <w:szCs w:val="22"/>
+        </w:rPr>
+        <w:t xml:space="preserve">Configuré alias de doble comando (bin de npm) para flujos rápidos de actualización (quick-push); publicado como paquete npm. </w:t>
+      </w:r>
+    </w:p>
+    <w:p>
+      <w:pPr>
+        <w:spacing w:after="0" w:line="259" w:lineRule="auto"/>
+        <w:ind w:right="0"/>
+        <w:rPr>
+          <w:szCs w:val="22"/>
+        </w:rPr>
+      </w:pPr>
+    </w:p>
+    <w:p>
+      <w:pPr>
+        <w:keepNext/>
         <w:tabs>
           <w:tab w:val="right" w:pos="11198"/>
         </w:tabs>
@@ -1019,16 +557,9 @@
           <w:b/>
           <w:szCs w:val="22"/>
         </w:rPr>
-        <w:lastRenderedPageBreak/>
-        <w:t xml:space="preserve">SERVIREPUESTOS GOYO </w:t>
-      </w:r>
-      <w:r>
-        <w:rPr>
-          <w:b/>
-          <w:szCs w:val="22"/>
-        </w:rPr>
+        <w:t xml:space="preserve">SIMATV </w:t>
         <w:tab/>
-        <w:t>Lima, Perú</w:t>
+        <w:t xml:space="preserve">Lima, Perú</w:t>
       </w:r>
       <w:r>
         <w:rPr>
@@ -1040,10 +571,11 @@
     </w:p>
     <w:p>
       <w:pPr>
+        <w:keepNext/>
         <w:tabs>
           <w:tab w:val="right" w:pos="11198"/>
         </w:tabs>
-        <w:spacing w:after="113" w:line="253" w:lineRule="auto"/>
+        <w:spacing w:after="113"/>
         <w:ind w:left="0" w:right="0" w:firstLine="0"/>
         <w:rPr>
           <w:szCs w:val="22"/>
@@ -1053,149 +585,85 @@
         <w:rPr>
           <w:szCs w:val="22"/>
         </w:rPr>
-        <w:t xml:space="preserve">Desarrollador </w:t>
-      </w:r>
-      <w:proofErr w:type="spellStart"/>
-      <w:r>
-        <w:rPr>
-          <w:szCs w:val="22"/>
-        </w:rPr>
-        <w:t>FullStack</w:t>
-      </w:r>
-      <w:proofErr w:type="spellEnd"/>
-      <w:r>
-        <w:rPr>
-          <w:szCs w:val="22"/>
-        </w:rPr>
-        <w:t xml:space="preserve"> </w:t>
-      </w:r>
-      <w:r>
-        <w:rPr>
-          <w:szCs w:val="22"/>
-        </w:rPr>
+        <w:t xml:space="preserve">Desarrollador FullStack </w:t>
         <w:tab/>
       </w:r>
       <w:r>
         <w:rPr>
           <w:i/>
-          <w:szCs w:val="22"/>
-        </w:rPr>
-        <w:t xml:space="preserve">Julio </w:t>
-      </w:r>
-      <w:r>
-        <w:rPr>
-          <w:i/>
-          <w:szCs w:val="22"/>
-        </w:rPr>
-        <w:t>2025 - Actualidad</w:t>
-      </w:r>
-    </w:p>
-    <w:p>
-      <w:pPr>
-        <w:pStyle w:val="NormalWeb"/>
+          <w:iCs/>
+          <w:szCs w:val="22"/>
+        </w:rPr>
+        <w:t xml:space="preserve">Marzo 2026 – Junio 2026</w:t>
+      </w:r>
+    </w:p>
+    <w:p>
+      <w:pPr>
+        <w:keepLines/>
         <w:numPr>
           <w:ilvl w:val="0"/>
-          <w:numId w:val="3"/>
+          <w:numId w:val="1"/>
         </w:numPr>
-        <w:rPr>
-          <w:rFonts w:ascii="Calibri" w:hAnsi="Calibri" w:cs="Calibri"/>
-          <w:sz w:val="22"/>
-          <w:szCs w:val="22"/>
-        </w:rPr>
-      </w:pPr>
-      <w:r>
-        <w:rPr>
-          <w:rFonts w:ascii="Calibri" w:hAnsi="Calibri" w:cs="Calibri"/>
-          <w:sz w:val="22"/>
-          <w:szCs w:val="22"/>
-        </w:rPr>
-        <w:t>Lideré el proceso de digitalización integral de la empresa</w:t>
-      </w:r>
-      <w:r>
-        <w:rPr>
-          <w:rFonts w:ascii="Calibri" w:hAnsi="Calibri" w:cs="Calibri"/>
-          <w:sz w:val="22"/>
-          <w:szCs w:val="22"/>
-        </w:rPr>
-        <w:t xml:space="preserve"> SERVIREPUESTOS GOYO</w:t>
-      </w:r>
-      <w:r>
-        <w:rPr>
-          <w:rFonts w:ascii="Calibri" w:hAnsi="Calibri" w:cs="Calibri"/>
-          <w:sz w:val="22"/>
-          <w:szCs w:val="22"/>
-        </w:rPr>
-        <w:t>, diseñando y desarrollando desde cero un software de gestión a medida para centralizar y optimizar el control de inventario y las operaciones comerciales.</w:t>
-      </w:r>
-    </w:p>
-    <w:p>
-      <w:pPr>
-        <w:pStyle w:val="NormalWeb"/>
+        <w:ind w:right="842" w:hanging="360"/>
+        <w:rPr>
+          <w:szCs w:val="22"/>
+        </w:rPr>
+      </w:pPr>
+      <w:r>
+        <w:rPr>
+          <w:szCs w:val="22"/>
+        </w:rPr>
+        <w:t xml:space="preserve">Co-desarrollé para SIMA una app de IPTV para Smart TVs y Android TV con streaming en vivo de alta disponibilidad, UI D-pad y HLS/DASH de baja latencia. </w:t>
+      </w:r>
+    </w:p>
+    <w:p>
+      <w:pPr>
         <w:numPr>
           <w:ilvl w:val="0"/>
-          <w:numId w:val="3"/>
+          <w:numId w:val="1"/>
         </w:numPr>
-        <w:rPr>
-          <w:rFonts w:ascii="Calibri" w:hAnsi="Calibri" w:cs="Calibri"/>
-          <w:sz w:val="22"/>
-          <w:szCs w:val="22"/>
-        </w:rPr>
-      </w:pPr>
-      <w:r>
-        <w:rPr>
-          <w:rFonts w:ascii="Calibri" w:hAnsi="Calibri" w:cs="Calibri"/>
-          <w:sz w:val="22"/>
-          <w:szCs w:val="22"/>
-        </w:rPr>
-        <w:t>Desarrollé e implementé módulos operativos clave para el ciclo de ingresos y egresos, incluyendo la gestión de productos, control de stock, cotizaciones, ventas, devoluciones y manejo de caja.</w:t>
-      </w:r>
-    </w:p>
-    <w:p>
-      <w:pPr>
-        <w:pStyle w:val="NormalWeb"/>
+        <w:ind w:right="842" w:hanging="360"/>
+        <w:rPr>
+          <w:szCs w:val="22"/>
+        </w:rPr>
+      </w:pPr>
+      <w:r>
+        <w:rPr>
+          <w:szCs w:val="22"/>
+        </w:rPr>
+        <w:t xml:space="preserve">Desarrollé la arquitectura de gestión de listas de canales e integré la sincronización de la Guía Electrónica de Programación (EPG). </w:t>
+      </w:r>
+    </w:p>
+    <w:p>
+      <w:pPr>
         <w:numPr>
           <w:ilvl w:val="0"/>
-          <w:numId w:val="3"/>
+          <w:numId w:val="1"/>
         </w:numPr>
-        <w:rPr>
-          <w:rFonts w:ascii="Calibri" w:hAnsi="Calibri" w:cs="Calibri"/>
-          <w:sz w:val="22"/>
-          <w:szCs w:val="22"/>
-        </w:rPr>
-      </w:pPr>
-      <w:r>
-        <w:rPr>
-          <w:rFonts w:ascii="Calibri" w:hAnsi="Calibri" w:cs="Calibri"/>
-          <w:sz w:val="22"/>
-          <w:szCs w:val="22"/>
-        </w:rPr>
-        <w:t>Construí la arquitectura administrativa del sistema, integrando bases de datos relacionales para la administración eficiente de clientes, proveedores, créditos y perfiles de empleados.</w:t>
-      </w:r>
-    </w:p>
-    <w:p>
-      <w:pPr>
-        <w:pStyle w:val="NormalWeb"/>
-        <w:numPr>
-          <w:ilvl w:val="0"/>
-          <w:numId w:val="3"/>
-        </w:numPr>
-        <w:rPr>
-          <w:rFonts w:ascii="Calibri" w:hAnsi="Calibri" w:cs="Calibri"/>
-          <w:sz w:val="22"/>
-          <w:szCs w:val="22"/>
-        </w:rPr>
-      </w:pPr>
-      <w:r>
-        <w:rPr>
-          <w:rFonts w:ascii="Calibri" w:hAnsi="Calibri" w:cs="Calibri"/>
-          <w:sz w:val="22"/>
-          <w:szCs w:val="22"/>
-        </w:rPr>
-        <w:t>Ejecuto el mantenimiento continuo y la escalabilidad del sistema, desplegando actualizaciones, optimizando el rendimiento y garantizando la estabilidad del software para el uso diario de la tienda.</w:t>
-      </w:r>
-    </w:p>
-    <w:p>
-      <w:pPr>
+        <w:ind w:right="842" w:hanging="360"/>
+        <w:rPr>
+          <w:szCs w:val="22"/>
+        </w:rPr>
+      </w:pPr>
+      <w:r>
+        <w:rPr>
+          <w:szCs w:val="22"/>
+        </w:rPr>
+        <w:t xml:space="preserve">Optimicé el rendimiento para una reproducción estable incluso en TVs con hardware limitado. </w:t>
+      </w:r>
+    </w:p>
+    <w:p>
+      <w:pPr>
+        <w:spacing w:after="0" w:line="259" w:lineRule="auto"/>
+        <w:ind w:right="0"/>
+        <w:rPr>
+          <w:szCs w:val="22"/>
+        </w:rPr>
+      </w:pPr>
+    </w:p>
+    <w:p>
+      <w:pPr>
+        <w:keepNext/>
         <w:tabs>
           <w:tab w:val="right" w:pos="11198"/>
         </w:tabs>
@@ -1210,15 +678,9 @@
           <w:b/>
           <w:szCs w:val="22"/>
         </w:rPr>
-        <w:t xml:space="preserve">RESCUEMAL </w:t>
-      </w:r>
-      <w:r>
-        <w:rPr>
-          <w:b/>
-          <w:szCs w:val="22"/>
-        </w:rPr>
+        <w:t xml:space="preserve">SERVIREPUESTOS GOYO </w:t>
         <w:tab/>
-        <w:t>Lima, Perú</w:t>
+        <w:t xml:space="preserve">Lima, Perú</w:t>
       </w:r>
       <w:r>
         <w:rPr>
@@ -1230,6 +692,7 @@
     </w:p>
     <w:p>
       <w:pPr>
+        <w:keepNext/>
         <w:tabs>
           <w:tab w:val="right" w:pos="11198"/>
         </w:tabs>
@@ -1243,62 +706,21 @@
         <w:rPr>
           <w:szCs w:val="22"/>
         </w:rPr>
-        <w:t xml:space="preserve">Desarrollador </w:t>
-      </w:r>
-      <w:proofErr w:type="spellStart"/>
-      <w:r>
-        <w:rPr>
-          <w:szCs w:val="22"/>
-        </w:rPr>
-        <w:t>FullStack</w:t>
-      </w:r>
-      <w:proofErr w:type="spellEnd"/>
-      <w:r>
-        <w:rPr>
-          <w:szCs w:val="22"/>
-        </w:rPr>
-        <w:t xml:space="preserve"> Mobile </w:t>
-      </w:r>
-      <w:r>
-        <w:rPr>
-          <w:szCs w:val="22"/>
-        </w:rPr>
+        <w:t xml:space="preserve">Desarrollador FullStack </w:t>
         <w:tab/>
       </w:r>
       <w:r>
         <w:rPr>
           <w:i/>
-          <w:szCs w:val="22"/>
-        </w:rPr>
-        <w:t>Septiembre –</w:t>
-      </w:r>
-      <w:proofErr w:type="gramStart"/>
-      <w:r>
-        <w:rPr>
-          <w:i/>
-          <w:szCs w:val="22"/>
-        </w:rPr>
-        <w:t>Diciembre</w:t>
-      </w:r>
-      <w:proofErr w:type="gramEnd"/>
-      <w:r>
-        <w:rPr>
-          <w:i/>
-          <w:szCs w:val="22"/>
-        </w:rPr>
-        <w:t xml:space="preserve"> 2025</w:t>
-      </w:r>
-      <w:r>
-        <w:rPr>
-          <w:b/>
-          <w:i/>
-          <w:szCs w:val="22"/>
-        </w:rPr>
-        <w:t xml:space="preserve">  </w:t>
-      </w:r>
-    </w:p>
-    <w:p>
-      <w:pPr>
+          <w:iCs/>
+          <w:szCs w:val="22"/>
+        </w:rPr>
+        <w:t xml:space="preserve">Julio 2025 – Junio 2026</w:t>
+      </w:r>
+    </w:p>
+    <w:p>
+      <w:pPr>
+        <w:keepLines/>
         <w:numPr>
           <w:ilvl w:val="0"/>
           <w:numId w:val="1"/>
@@ -1312,7 +734,7 @@
         <w:rPr>
           <w:szCs w:val="22"/>
         </w:rPr>
-        <w:t xml:space="preserve">Desarrollé una aplicación móvil nativa orientada a la solución del problema de animales en situación de calle, alineada con los Objetivos de Desarrollo Sostenible (ODS) para promover comunidades más sostenibles y responsables. </w:t>
+        <w:t xml:space="preserve">Lideré la digitalización de SERVIREPUESTOS GOYO, diseñando desde cero un ERP multi-sucursal con Next.js y Firebase (Firestore independiente por sede). </w:t>
       </w:r>
     </w:p>
     <w:p>
@@ -1330,21 +752,7 @@
         <w:rPr>
           <w:szCs w:val="22"/>
         </w:rPr>
-        <w:t xml:space="preserve">Implementé la arquitectura móvil utilizando una combinación de </w:t>
-      </w:r>
-      <w:proofErr w:type="spellStart"/>
-      <w:r>
-        <w:rPr>
-          <w:szCs w:val="22"/>
-        </w:rPr>
-        <w:t>Kotlin</w:t>
-      </w:r>
-      <w:proofErr w:type="spellEnd"/>
-      <w:r>
-        <w:rPr>
-          <w:szCs w:val="22"/>
-        </w:rPr>
-        <w:t xml:space="preserve"> y Java, garantizando un rendimiento óptimo y una experiencia de usuario fluida en dispositivos Android. </w:t>
+        <w:t xml:space="preserve">Implementé el módulo de inventario con control de stock por lotes bajo lógica FIFO y transacciones atómicas, garantizando trazabilidad de costos y precios de compra/venta. </w:t>
       </w:r>
     </w:p>
     <w:p>
@@ -1362,53 +770,78 @@
         <w:rPr>
           <w:szCs w:val="22"/>
         </w:rPr>
-        <w:t xml:space="preserve">Integré servicios avanzados de Google Cloud </w:t>
-      </w:r>
-      <w:proofErr w:type="spellStart"/>
-      <w:r>
-        <w:rPr>
-          <w:szCs w:val="22"/>
-        </w:rPr>
-        <w:t>Platform</w:t>
-      </w:r>
-      <w:proofErr w:type="spellEnd"/>
-      <w:r>
-        <w:rPr>
-          <w:szCs w:val="22"/>
-        </w:rPr>
-        <w:t xml:space="preserve">, específicamente Google </w:t>
-      </w:r>
-      <w:proofErr w:type="spellStart"/>
-      <w:r>
-        <w:rPr>
-          <w:szCs w:val="22"/>
-        </w:rPr>
-        <w:t>Maps</w:t>
-      </w:r>
-      <w:proofErr w:type="spellEnd"/>
-      <w:r>
-        <w:rPr>
+        <w:t xml:space="preserve">Desarrollé los módulos de ventas, cotizaciones, créditos (incluido crédito acumulativo) y devoluciones, con generación de PDFs, exportación a Excel y un dashboard analítico con Recharts. </w:t>
+      </w:r>
+    </w:p>
+    <w:p>
+      <w:pPr>
+        <w:spacing w:after="0" w:line="259" w:lineRule="auto"/>
+        <w:ind w:right="0"/>
+        <w:rPr>
+          <w:szCs w:val="22"/>
+        </w:rPr>
+      </w:pPr>
+    </w:p>
+    <w:p>
+      <w:pPr>
+        <w:keepNext/>
+        <w:tabs>
+          <w:tab w:val="right" w:pos="11198"/>
+        </w:tabs>
+        <w:spacing w:after="1" w:line="258" w:lineRule="auto"/>
+        <w:ind w:left="0" w:right="0" w:firstLine="0"/>
+        <w:rPr>
+          <w:szCs w:val="22"/>
+        </w:rPr>
+      </w:pPr>
+      <w:r>
+        <w:rPr>
+          <w:b/>
+          <w:szCs w:val="22"/>
+        </w:rPr>
+        <w:t xml:space="preserve">RESCUEMAL </w:t>
+        <w:tab/>
+        <w:t xml:space="preserve">Lima, Perú</w:t>
+      </w:r>
+      <w:r>
+        <w:rPr>
+          <w:i/>
           <w:szCs w:val="22"/>
         </w:rPr>
         <w:t xml:space="preserve"> </w:t>
       </w:r>
-      <w:proofErr w:type="spellStart"/>
-      <w:r>
-        <w:rPr>
-          <w:szCs w:val="22"/>
-        </w:rPr>
-        <w:t>Platform</w:t>
-      </w:r>
-      <w:proofErr w:type="spellEnd"/>
-      <w:r>
-        <w:rPr>
-          <w:szCs w:val="22"/>
-        </w:rPr>
-        <w:t xml:space="preserve">, para permitir la geolocalización exacta de reportes de animales rescatados y el trazado de rutas para rescatistas. </w:t>
-      </w:r>
-    </w:p>
-    <w:p>
-      <w:pPr>
+    </w:p>
+    <w:p>
+      <w:pPr>
+        <w:keepNext/>
+        <w:tabs>
+          <w:tab w:val="right" w:pos="11198"/>
+        </w:tabs>
+        <w:spacing w:after="113"/>
+        <w:ind w:left="0" w:right="0" w:firstLine="0"/>
+        <w:rPr>
+          <w:szCs w:val="22"/>
+        </w:rPr>
+      </w:pPr>
+      <w:r>
+        <w:rPr>
+          <w:szCs w:val="22"/>
+        </w:rPr>
+        <w:t xml:space="preserve">Desarrollador FullStack Mobile </w:t>
+        <w:tab/>
+      </w:r>
+      <w:r>
+        <w:rPr>
+          <w:i/>
+          <w:iCs/>
+          <w:szCs w:val="22"/>
+        </w:rPr>
+        <w:t xml:space="preserve">Septiembre – Diciembre 2025</w:t>
+      </w:r>
+    </w:p>
+    <w:p>
+      <w:pPr>
+        <w:keepLines/>
         <w:numPr>
           <w:ilvl w:val="0"/>
           <w:numId w:val="1"/>
@@ -1422,49 +855,7 @@
         <w:rPr>
           <w:szCs w:val="22"/>
         </w:rPr>
-        <w:t xml:space="preserve">Diseñé y gestioné la infraestructura de datos en </w:t>
-      </w:r>
-      <w:proofErr w:type="spellStart"/>
-      <w:r>
-        <w:rPr>
-          <w:szCs w:val="22"/>
-        </w:rPr>
-        <w:t>Firebase</w:t>
-      </w:r>
-      <w:proofErr w:type="spellEnd"/>
-      <w:r>
-        <w:rPr>
-          <w:szCs w:val="22"/>
-        </w:rPr>
-        <w:t xml:space="preserve">, utilizando Cloud </w:t>
-      </w:r>
-      <w:proofErr w:type="spellStart"/>
-      <w:r>
-        <w:rPr>
-          <w:szCs w:val="22"/>
-        </w:rPr>
-        <w:t>Firestore</w:t>
-      </w:r>
-      <w:proofErr w:type="spellEnd"/>
-      <w:r>
-        <w:rPr>
-          <w:szCs w:val="22"/>
-        </w:rPr>
-        <w:t xml:space="preserve"> para la sincronización en tiempo real de los reportes y </w:t>
-      </w:r>
-      <w:proofErr w:type="spellStart"/>
-      <w:r>
-        <w:rPr>
-          <w:szCs w:val="22"/>
-        </w:rPr>
-        <w:t>Firebase</w:t>
-      </w:r>
-      <w:proofErr w:type="spellEnd"/>
-      <w:r>
-        <w:rPr>
-          <w:szCs w:val="22"/>
-        </w:rPr>
-        <w:t xml:space="preserve"> Storage para el manejo de evidencias fotográficas de los rescates. </w:t>
+        <w:t xml:space="preserve">Desarrollé una app móvil nativa (Kotlin/Java) para el rescate de animales en situación de calle, alineada a los ODS. </w:t>
       </w:r>
     </w:p>
     <w:p>
@@ -1482,7 +873,25 @@
         <w:rPr>
           <w:szCs w:val="22"/>
         </w:rPr>
-        <w:t xml:space="preserve">Digitalicé el proceso de rescate y adopción, sustituyendo métodos informales por una plataforma centralizada que mejora la trazabilidad y aumenta las tasas de éxito en las adopciones. </w:t>
+        <w:t xml:space="preserve">Integré Google Maps Platform para geolocalizar reportes y trazar rutas de rescate. </w:t>
+      </w:r>
+    </w:p>
+    <w:p>
+      <w:pPr>
+        <w:numPr>
+          <w:ilvl w:val="0"/>
+          <w:numId w:val="1"/>
+        </w:numPr>
+        <w:ind w:right="842" w:hanging="360"/>
+        <w:rPr>
+          <w:szCs w:val="22"/>
+        </w:rPr>
+      </w:pPr>
+      <w:r>
+        <w:rPr>
+          <w:szCs w:val="22"/>
+        </w:rPr>
+        <w:t xml:space="preserve">Gestioné la infraestructura en Firebase (Firestore y Storage) para sincronizar reportes y evidencias en tiempo real. </w:t>
       </w:r>
     </w:p>
     <w:p>
@@ -1496,6 +905,7 @@
     </w:p>
     <w:p>
       <w:pPr>
+        <w:keepNext/>
         <w:tabs>
           <w:tab w:val="right" w:pos="11198"/>
         </w:tabs>
@@ -1510,15 +920,9 @@
           <w:b/>
           <w:szCs w:val="22"/>
         </w:rPr>
-        <w:t xml:space="preserve">SISTEMA VETERINARIO VETWEB </w:t>
-      </w:r>
-      <w:r>
-        <w:rPr>
-          <w:b/>
-          <w:szCs w:val="22"/>
-        </w:rPr>
+        <w:t xml:space="preserve">L'ELIXIR - CATÁLOGO VIRTUAL </w:t>
         <w:tab/>
-        <w:t>Lima, Perú</w:t>
+        <w:t xml:space="preserve">Lima, Perú</w:t>
       </w:r>
       <w:r>
         <w:rPr>
@@ -1530,6 +934,7 @@
     </w:p>
     <w:p>
       <w:pPr>
+        <w:keepNext/>
         <w:tabs>
           <w:tab w:val="right" w:pos="11198"/>
         </w:tabs>
@@ -1543,26 +948,7 @@
         <w:rPr>
           <w:szCs w:val="22"/>
         </w:rPr>
-        <w:t xml:space="preserve">Desarrollador </w:t>
-      </w:r>
-      <w:proofErr w:type="spellStart"/>
-      <w:r>
-        <w:rPr>
-          <w:szCs w:val="22"/>
-        </w:rPr>
-        <w:t>FullStack</w:t>
-      </w:r>
-      <w:proofErr w:type="spellEnd"/>
-      <w:r>
-        <w:rPr>
-          <w:szCs w:val="22"/>
-        </w:rPr>
-        <w:t xml:space="preserve"> </w:t>
-      </w:r>
-      <w:r>
-        <w:rPr>
-          <w:szCs w:val="22"/>
-        </w:rPr>
+        <w:t xml:space="preserve">Desarrollador FrontEnd </w:t>
         <w:tab/>
       </w:r>
       <w:r>
@@ -1571,25 +957,12 @@
           <w:iCs/>
           <w:szCs w:val="22"/>
         </w:rPr>
-        <w:t>Abril – Julio 2025</w:t>
-      </w:r>
-      <w:r>
-        <w:rPr>
-          <w:b/>
-          <w:i/>
-          <w:szCs w:val="22"/>
-        </w:rPr>
-        <w:t xml:space="preserve">  </w:t>
-      </w:r>
-      <w:r>
-        <w:rPr>
-          <w:szCs w:val="22"/>
-        </w:rPr>
-        <w:t xml:space="preserve"> </w:t>
-      </w:r>
-    </w:p>
-    <w:p>
-      <w:pPr>
+        <w:t xml:space="preserve">2025</w:t>
+      </w:r>
+    </w:p>
+    <w:p>
+      <w:pPr>
+        <w:keepLines/>
         <w:numPr>
           <w:ilvl w:val="0"/>
           <w:numId w:val="1"/>
@@ -1603,7 +976,7 @@
         <w:rPr>
           <w:szCs w:val="22"/>
         </w:rPr>
-        <w:t xml:space="preserve">Desarrollo de proyecto universitario dedicado para la Veterinaria Cartagena (VES) sobre un sitio web para la gestión de la veterinaria  </w:t>
+        <w:t xml:space="preserve">Desarrollé un catálogo virtual publicitario para la venta de perfumes, orientado a conversión. </w:t>
       </w:r>
     </w:p>
     <w:p>
@@ -1621,236 +994,16 @@
         <w:rPr>
           <w:szCs w:val="22"/>
         </w:rPr>
-        <w:t xml:space="preserve">Construí funcionalidades completas utilizando .NET con ASPX y C#, integrando lógica para el manejo de usuarios, doctores, pacientes, citas y reportes. </w:t>
-      </w:r>
-    </w:p>
-    <w:p>
-      <w:pPr>
-        <w:numPr>
-          <w:ilvl w:val="0"/>
-          <w:numId w:val="1"/>
-        </w:numPr>
-        <w:ind w:right="842" w:hanging="360"/>
-        <w:rPr>
-          <w:szCs w:val="22"/>
-        </w:rPr>
-      </w:pPr>
-      <w:r>
-        <w:rPr>
-          <w:szCs w:val="22"/>
-        </w:rPr>
-        <w:t xml:space="preserve">Implementé la persistencia de datos mediante Microsoft SQL Server, desarrollando consultas SQL personalizadas y trabajando con relaciones complejas entre tablas. </w:t>
-      </w:r>
-      <w:r>
-        <w:rPr>
-          <w:i/>
-          <w:szCs w:val="22"/>
-        </w:rPr>
-        <w:t xml:space="preserve"> </w:t>
-      </w:r>
-    </w:p>
-    <w:p>
-      <w:pPr>
-        <w:ind w:left="770" w:right="842" w:firstLine="0"/>
-        <w:rPr>
-          <w:szCs w:val="22"/>
-        </w:rPr>
-      </w:pPr>
-    </w:p>
-    <w:p>
-      <w:pPr>
-        <w:spacing w:after="0" w:line="259" w:lineRule="auto"/>
-        <w:ind w:left="108" w:right="0" w:firstLine="0"/>
-        <w:rPr>
-          <w:szCs w:val="22"/>
-        </w:rPr>
-      </w:pPr>
-      <w:r>
-        <w:rPr>
-          <w:szCs w:val="22"/>
-        </w:rPr>
-        <w:t xml:space="preserve"> </w:t>
-      </w:r>
-    </w:p>
-    <w:p>
-      <w:pPr>
-        <w:tabs>
-          <w:tab w:val="right" w:pos="11198"/>
-        </w:tabs>
-        <w:spacing w:after="1" w:line="258" w:lineRule="auto"/>
-        <w:ind w:left="0" w:right="0" w:firstLine="0"/>
-        <w:rPr>
-          <w:szCs w:val="22"/>
-        </w:rPr>
-      </w:pPr>
-      <w:r>
-        <w:rPr>
-          <w:b/>
-          <w:szCs w:val="22"/>
-        </w:rPr>
-        <w:lastRenderedPageBreak/>
-        <w:t xml:space="preserve">LANDING PAGE PARA VETERINARIA </w:t>
-      </w:r>
-      <w:r>
-        <w:rPr>
-          <w:b/>
-          <w:szCs w:val="22"/>
-        </w:rPr>
-        <w:tab/>
-      </w:r>
-      <w:r>
-        <w:rPr>
-          <w:b/>
-          <w:szCs w:val="22"/>
-        </w:rPr>
-        <w:t xml:space="preserve">Lima, Peru </w:t>
-      </w:r>
-    </w:p>
-    <w:p>
-      <w:pPr>
-        <w:tabs>
-          <w:tab w:val="right" w:pos="11198"/>
-        </w:tabs>
-        <w:spacing w:after="217"/>
-        <w:ind w:left="0" w:right="0" w:firstLine="0"/>
-        <w:rPr>
-          <w:szCs w:val="22"/>
-        </w:rPr>
-      </w:pPr>
-      <w:r>
-        <w:rPr>
-          <w:szCs w:val="22"/>
-        </w:rPr>
-        <w:t xml:space="preserve">Desarrollador </w:t>
-      </w:r>
-      <w:proofErr w:type="spellStart"/>
-      <w:r>
-        <w:rPr>
-          <w:szCs w:val="22"/>
-        </w:rPr>
-        <w:t>FrontEnd</w:t>
-      </w:r>
-      <w:proofErr w:type="spellEnd"/>
-      <w:r>
-        <w:rPr>
-          <w:szCs w:val="22"/>
-        </w:rPr>
-        <w:t xml:space="preserve"> </w:t>
-      </w:r>
-      <w:r>
-        <w:rPr>
-          <w:szCs w:val="22"/>
-        </w:rPr>
-        <w:tab/>
-      </w:r>
-      <w:proofErr w:type="gramStart"/>
-      <w:r>
-        <w:rPr>
-          <w:i/>
-          <w:szCs w:val="22"/>
-        </w:rPr>
-        <w:t>Abril</w:t>
-      </w:r>
-      <w:proofErr w:type="gramEnd"/>
-      <w:r>
-        <w:rPr>
-          <w:i/>
-          <w:szCs w:val="22"/>
-        </w:rPr>
-        <w:t xml:space="preserve"> 2025</w:t>
-      </w:r>
-      <w:r>
-        <w:rPr>
-          <w:i/>
-          <w:szCs w:val="22"/>
-        </w:rPr>
-        <w:t xml:space="preserve"> </w:t>
-      </w:r>
-    </w:p>
-    <w:p>
-      <w:pPr>
-        <w:numPr>
-          <w:ilvl w:val="0"/>
-          <w:numId w:val="1"/>
-        </w:numPr>
-        <w:ind w:right="842" w:hanging="360"/>
-        <w:rPr>
-          <w:szCs w:val="22"/>
-        </w:rPr>
-      </w:pPr>
-      <w:r>
-        <w:rPr>
-          <w:szCs w:val="22"/>
-        </w:rPr>
-        <w:t xml:space="preserve">Desarrollé una Landing Page publicitaria dedicada para una veterinaria. </w:t>
-      </w:r>
-    </w:p>
-    <w:p>
-      <w:pPr>
-        <w:numPr>
-          <w:ilvl w:val="0"/>
-          <w:numId w:val="1"/>
-        </w:numPr>
-        <w:ind w:right="842" w:hanging="360"/>
-        <w:rPr>
-          <w:szCs w:val="22"/>
-        </w:rPr>
-      </w:pPr>
-      <w:r>
-        <w:rPr>
-          <w:szCs w:val="22"/>
-        </w:rPr>
-        <w:t>Diseñé una interfaz de usuario limpia y profesional utilizando HTML5 y CSS3, priorizando la legibilidad y el acceso rápido a la información de contacto.</w:t>
-      </w:r>
-      <w:r>
-        <w:rPr>
-          <w:i/>
-          <w:szCs w:val="22"/>
-        </w:rPr>
-        <w:t xml:space="preserve"> </w:t>
-      </w:r>
-    </w:p>
-    <w:p>
-      <w:pPr>
-        <w:numPr>
-          <w:ilvl w:val="0"/>
-          <w:numId w:val="1"/>
-        </w:numPr>
-        <w:spacing w:after="0" w:line="253" w:lineRule="auto"/>
-        <w:ind w:right="842" w:hanging="360"/>
-        <w:rPr>
-          <w:iCs/>
-          <w:szCs w:val="22"/>
-        </w:rPr>
-      </w:pPr>
-      <w:r>
-        <w:rPr>
-          <w:iCs/>
-          <w:szCs w:val="22"/>
-        </w:rPr>
-        <w:t>Optimicé la experiencia de navegación mediante JavaScript, permitiendo una interactividad fluida y una estructura de una sola página (</w:t>
-      </w:r>
-      <w:proofErr w:type="gramStart"/>
-      <w:r>
-        <w:rPr>
-          <w:iCs/>
-          <w:szCs w:val="22"/>
-        </w:rPr>
-        <w:t>Single</w:t>
-      </w:r>
-      <w:proofErr w:type="gramEnd"/>
-      <w:r>
-        <w:rPr>
-          <w:iCs/>
-          <w:szCs w:val="22"/>
-        </w:rPr>
-        <w:t xml:space="preserve"> Page) eficiente. </w:t>
-      </w:r>
-    </w:p>
-    <w:p>
-      <w:pPr>
-        <w:spacing w:after="71" w:line="259" w:lineRule="auto"/>
-        <w:ind w:left="0" w:right="0" w:firstLine="0"/>
+        <w:t xml:space="preserve">Construí el sitio con Astro para lograr una carga rápida y una experiencia de navegación ligera. </w:t>
+      </w:r>
+    </w:p>
+    <w:p>
+      <w:pPr>
+        <w:spacing w:after="120" w:line="259" w:lineRule="auto"/>
+        <w:ind w:right="0"/>
+        <w:rPr>
+          <w:szCs w:val="22"/>
+        </w:rPr>
       </w:pPr>
     </w:p>
     <w:p>
@@ -1952,11 +1105,6 @@
           <w:b/>
         </w:rPr>
         <w:t xml:space="preserve">UNIVERSIDAD AUTONOMA DEL PERÚ </w:t>
-      </w:r>
-      <w:r>
-        <w:rPr>
-          <w:b/>
-        </w:rPr>
         <w:tab/>
         <w:t>Lima, Perú</w:t>
       </w:r>
@@ -1977,142 +1125,14 @@
       </w:pPr>
       <w:r>
         <w:t xml:space="preserve">Ingeniería de software </w:t>
-      </w:r>
-      <w:r>
         <w:tab/>
       </w:r>
-      <w:proofErr w:type="gramStart"/>
       <w:r>
         <w:rPr>
           <w:i/>
           <w:iCs/>
         </w:rPr>
-        <w:t>Marzo</w:t>
-      </w:r>
-      <w:proofErr w:type="gramEnd"/>
-      <w:r>
-        <w:rPr>
-          <w:i/>
-          <w:iCs/>
-        </w:rPr>
-        <w:t xml:space="preserve"> 2023 - Actualidad</w:t>
-      </w:r>
-    </w:p>
-    <w:p>
-      <w:pPr>
-        <w:spacing w:after="1" w:line="258" w:lineRule="auto"/>
-        <w:ind w:right="0"/>
-      </w:pPr>
-      <w:r>
-        <w:rPr>
-          <w:noProof/>
-        </w:rPr>
-        <mc:AlternateContent>
-          <mc:Choice Requires="wpg">
-            <w:drawing>
-              <wp:anchor distT="0" distB="0" distL="114300" distR="114300" simplePos="0" relativeHeight="251658240" behindDoc="0" locked="0" layoutInCell="1" allowOverlap="1" wp14:anchorId="499D35B7" wp14:editId="2E760151">
-                <wp:simplePos x="0" y="0"/>
-                <wp:positionH relativeFrom="page">
-                  <wp:posOffset>359664</wp:posOffset>
-                </wp:positionH>
-                <wp:positionV relativeFrom="page">
-                  <wp:posOffset>9686544</wp:posOffset>
-                </wp:positionV>
-                <wp:extent cx="7109460" cy="6096"/>
-                <wp:effectExtent l="0" t="0" r="0" b="0"/>
-                <wp:wrapTopAndBottom/>
-                <wp:docPr id="2707" name="Group 2707"/>
-                <wp:cNvGraphicFramePr/>
-                <a:graphic xmlns:a="http://schemas.openxmlformats.org/drawingml/2006/main">
-                  <a:graphicData uri="http://schemas.microsoft.com/office/word/2010/wordprocessingGroup">
-                    <wpg:wgp>
-                      <wpg:cNvGrpSpPr/>
-                      <wpg:grpSpPr>
-                        <a:xfrm>
-                          <a:off x="0" y="0"/>
-                          <a:ext cx="7109460" cy="6096"/>
-                          <a:chOff x="0" y="0"/>
-                          <a:chExt cx="7109460" cy="6096"/>
-                        </a:xfrm>
-                      </wpg:grpSpPr>
-                      <wps:wsp>
-                        <wps:cNvPr id="3499" name="Shape 3499"/>
-                        <wps:cNvSpPr/>
-                        <wps:spPr>
-                          <a:xfrm>
-                            <a:off x="0" y="0"/>
-                            <a:ext cx="7109460" cy="9144"/>
-                          </a:xfrm>
-                          <a:custGeom>
-                            <a:avLst/>
-                            <a:gdLst/>
-                            <a:ahLst/>
-                            <a:cxnLst/>
-                            <a:rect l="0" t="0" r="0" b="0"/>
-                            <a:pathLst>
-                              <a:path w="7109460" h="9144">
-                                <a:moveTo>
-                                  <a:pt x="0" y="0"/>
-                                </a:moveTo>
-                                <a:lnTo>
-                                  <a:pt x="7109460" y="0"/>
-                                </a:lnTo>
-                                <a:lnTo>
-                                  <a:pt x="7109460" y="9144"/>
-                                </a:lnTo>
-                                <a:lnTo>
-                                  <a:pt x="0" y="9144"/>
-                                </a:lnTo>
-                                <a:lnTo>
-                                  <a:pt x="0" y="0"/>
-                                </a:lnTo>
-                              </a:path>
-                            </a:pathLst>
-                          </a:custGeom>
-                          <a:ln w="0" cap="flat">
-                            <a:miter lim="127000"/>
-                          </a:ln>
-                        </wps:spPr>
-                        <wps:style>
-                          <a:lnRef idx="0">
-                            <a:srgbClr val="000000">
-                              <a:alpha val="0"/>
-                            </a:srgbClr>
-                          </a:lnRef>
-                          <a:fillRef idx="1">
-                            <a:srgbClr val="000000"/>
-                          </a:fillRef>
-                          <a:effectRef idx="0">
-                            <a:scrgbClr r="0" g="0" b="0"/>
-                          </a:effectRef>
-                          <a:fontRef idx="none"/>
-                        </wps:style>
-                        <wps:bodyPr/>
-                      </wps:wsp>
-                    </wpg:wgp>
-                  </a:graphicData>
-                </a:graphic>
-              </wp:anchor>
-            </w:drawing>
-          </mc:Choice>
-          <mc:Fallback>
-            <w:pict>
-              <v:group w14:anchorId="7E9BFB0A" id="Group 2707" o:spid="_x0000_s1026" style="position:absolute;margin-left:28.3pt;margin-top:762.7pt;width:559.8pt;height:.5pt;z-index:251658240;mso-position-horizontal-relative:page;mso-position-vertical-relative:page" coordsize="71094,60" o:gfxdata="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">
-                <v:shape id="Shape 3499" o:spid="_x0000_s1027" style="position:absolute;width:71094;height:91;visibility:visible;mso-wrap-style:square;v-text-anchor:top" coordsize="7109460,9144" o:gfxdata="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" path="m,l7109460,r,9144l,9144,,e" fillcolor="black" stroked="f" strokeweight="0">
-                  <v:stroke miterlimit="83231f" joinstyle="miter"/>
-                  <v:path arrowok="t" textboxrect="0,0,7109460,9144"/>
-                </v:shape>
-                <w10:wrap type="topAndBottom" anchorx="page" anchory="page"/>
-              </v:group>
-            </w:pict>
-          </mc:Fallback>
-        </mc:AlternateContent>
-      </w:r>
-      <w:r>
-        <w:rPr>
-          <w:b/>
-        </w:rPr>
-        <w:t xml:space="preserve">INGLES I, II </w:t>
+        <w:t xml:space="preserve">Marzo 2023 - Actualidad</w:t>
       </w:r>
     </w:p>
     <w:p>
@@ -2121,15 +1141,19 @@
         <w:ind w:right="842"/>
       </w:pPr>
       <w:r>
-        <w:t xml:space="preserve">Universidad </w:t>
-      </w:r>
-      <w:proofErr w:type="spellStart"/>
-      <w:r>
-        <w:t>Autonoma</w:t>
-      </w:r>
-      <w:proofErr w:type="spellEnd"/>
-      <w:r>
-        <w:t xml:space="preserve"> del Peru </w:t>
+        <w:rPr>
+          <w:b/>
+        </w:rPr>
+        <w:t xml:space="preserve">INGLES I, II </w:t>
+      </w:r>
+    </w:p>
+    <w:p>
+      <w:pPr>
+        <w:spacing w:after="7"/>
+        <w:ind w:right="842"/>
+      </w:pPr>
+      <w:r>
+        <w:t xml:space="preserve">Universidad Autonoma del Peru </w:t>
       </w:r>
     </w:p>
     <w:p>
@@ -2299,13 +1323,7 @@
         <w:jc w:val="both"/>
       </w:pPr>
       <w:r>
-        <w:t>HABILIDADES T</w:t>
-      </w:r>
-      <w:r>
-        <w:t>É</w:t>
-      </w:r>
-      <w:r>
-        <w:t xml:space="preserve">CNICAS </w:t>
+        <w:t xml:space="preserve">HABILIDADES TÉCNICAS </w:t>
       </w:r>
     </w:p>
     <w:p>
@@ -2393,23 +1411,7 @@
         <w:ind w:left="600" w:right="842" w:hanging="190"/>
       </w:pPr>
       <w:r>
-        <w:t xml:space="preserve">Lenguajes: JavaScript, </w:t>
-      </w:r>
-      <w:proofErr w:type="spellStart"/>
-      <w:r>
-        <w:t>TypeScript</w:t>
-      </w:r>
-      <w:proofErr w:type="spellEnd"/>
-      <w:r>
-        <w:t xml:space="preserve">, C#, Python, Java, </w:t>
-      </w:r>
-      <w:proofErr w:type="spellStart"/>
-      <w:r>
-        <w:t>Kotlin</w:t>
-      </w:r>
-      <w:proofErr w:type="spellEnd"/>
-      <w:r>
-        <w:t xml:space="preserve">, SQL. </w:t>
+        <w:t xml:space="preserve">Lenguajes: JavaScript, TypeScript, C#, Python, Java, Kotlin, SQL. </w:t>
       </w:r>
     </w:p>
     <w:p>
@@ -2421,37 +1423,7 @@
         <w:ind w:left="600" w:right="842" w:hanging="190"/>
       </w:pPr>
       <w:r>
-        <w:t>Tecnologías Web (</w:t>
-      </w:r>
-      <w:proofErr w:type="spellStart"/>
-      <w:r>
-        <w:t>Frontend</w:t>
-      </w:r>
-      <w:proofErr w:type="spellEnd"/>
-      <w:r>
-        <w:t xml:space="preserve">): HTML5, CSS3, </w:t>
-      </w:r>
-      <w:proofErr w:type="spellStart"/>
-      <w:r>
-        <w:t>React</w:t>
-      </w:r>
-      <w:proofErr w:type="spellEnd"/>
-      <w:r>
-        <w:t>, Tailwind</w:t>
-      </w:r>
-      <w:r>
-        <w:t>,</w:t>
-      </w:r>
-      <w:r>
-        <w:t xml:space="preserve"> CSS, Bootstrap, Responsive </w:t>
-      </w:r>
-      <w:proofErr w:type="spellStart"/>
-      <w:r>
-        <w:t>Design</w:t>
-      </w:r>
-      <w:proofErr w:type="spellEnd"/>
-      <w:r>
-        <w:t xml:space="preserve">. </w:t>
+        <w:t xml:space="preserve">Tecnologías Web (Frontend): HTML5, CSS3, React, Astro, Tailwind, Bootstrap, Responsive Design. </w:t>
       </w:r>
     </w:p>
     <w:p>
@@ -2462,29 +1434,8 @@
         </w:numPr>
         <w:ind w:left="600" w:right="842" w:hanging="190"/>
       </w:pPr>
-      <w:proofErr w:type="spellStart"/>
-      <w:r>
-        <w:t>Backend</w:t>
-      </w:r>
-      <w:proofErr w:type="spellEnd"/>
-      <w:r>
-        <w:t xml:space="preserve"> &amp; Arquitectura: Node.js (Express), .NET (ASPX), </w:t>
-      </w:r>
-      <w:proofErr w:type="spellStart"/>
-      <w:r>
-        <w:t>RESTful</w:t>
-      </w:r>
-      <w:proofErr w:type="spellEnd"/>
-      <w:r>
-        <w:t xml:space="preserve"> </w:t>
-      </w:r>
-      <w:proofErr w:type="spellStart"/>
-      <w:r>
-        <w:t>APIs</w:t>
-      </w:r>
-      <w:proofErr w:type="spellEnd"/>
-      <w:r>
-        <w:t>, Patrón MVVM/MVC.</w:t>
+      <w:r>
+        <w:t xml:space="preserve">Backend &amp; Arquitectura: Node.js (Express), .NET (ASPX), Supabase (Edge Functions), Meta WhatsApp Business API, RESTful APIs, Patrón MVVM/MVC.</w:t>
       </w:r>
     </w:p>
     <w:p>
@@ -2496,36 +1447,7 @@
         <w:ind w:left="600" w:right="842" w:hanging="190"/>
       </w:pPr>
       <w:r>
-        <w:t>Desarrollo Mobile</w:t>
-      </w:r>
-      <w:r>
-        <w:t>,</w:t>
-      </w:r>
-      <w:r>
-        <w:t xml:space="preserve"> TV</w:t>
-      </w:r>
-      <w:r>
-        <w:t xml:space="preserve"> &amp; Videojuegos</w:t>
-      </w:r>
-      <w:r>
-        <w:t xml:space="preserve">: Android SDK, Android Studio, </w:t>
-      </w:r>
-      <w:proofErr w:type="spellStart"/>
-      <w:r>
-        <w:t>ExoPlayer</w:t>
-      </w:r>
-      <w:proofErr w:type="spellEnd"/>
-      <w:r>
-        <w:t>, HLS/DASH</w:t>
-      </w:r>
-      <w:r>
-        <w:t xml:space="preserve">, </w:t>
-      </w:r>
-      <w:r>
-        <w:t>Unity (Desarrollo de Juegos 2D y 3D)</w:t>
-      </w:r>
-      <w:r>
-        <w:t>.</w:t>
+        <w:t xml:space="preserve">Desarrollo Mobile, TV &amp; Videojuegos: Android SDK, Android Studio, Expo / React Native, ExoPlayer, HLS/DASH, Unity (Desarrollo de Juegos 2D y 3D).</w:t>
       </w:r>
     </w:p>
     <w:p>
@@ -2537,23 +1459,7 @@
         <w:ind w:left="600" w:right="842" w:hanging="190"/>
       </w:pPr>
       <w:r>
-        <w:t xml:space="preserve">Bases de Datos: Microsoft SQL Server, MySQL, </w:t>
-      </w:r>
-      <w:proofErr w:type="spellStart"/>
-      <w:r>
-        <w:t>Firebase</w:t>
-      </w:r>
-      <w:proofErr w:type="spellEnd"/>
-      <w:r>
-        <w:t xml:space="preserve"> (Cloud </w:t>
-      </w:r>
-      <w:proofErr w:type="spellStart"/>
-      <w:r>
-        <w:t>Firestore</w:t>
-      </w:r>
-      <w:proofErr w:type="spellEnd"/>
-      <w:r>
-        <w:t xml:space="preserve">). </w:t>
+        <w:t xml:space="preserve">Bases de Datos: Microsoft SQL Server, MySQL, Firebase (Cloud Firestore). </w:t>
       </w:r>
     </w:p>
     <w:p>
@@ -2565,15 +1471,7 @@
         <w:ind w:left="600" w:right="842" w:hanging="190"/>
       </w:pPr>
       <w:r>
-        <w:t xml:space="preserve">Herramientas e </w:t>
-      </w:r>
-      <w:proofErr w:type="spellStart"/>
-      <w:r>
-        <w:t>IDEs</w:t>
-      </w:r>
-      <w:proofErr w:type="spellEnd"/>
-      <w:r>
-        <w:t>: Git, GitHub, Visual Studio, VS Code, IntelliJ IDEA, Figma.</w:t>
+        <w:t xml:space="preserve">Herramientas e IDEs: Git, GitHub, Visual Studio, VS Code, IntelliJ IDEA, Figma.</w:t>
       </w:r>
     </w:p>
     <w:p>
@@ -2585,39 +1483,7 @@
         <w:ind w:left="600" w:right="842" w:hanging="190"/>
       </w:pPr>
       <w:r>
-        <w:t xml:space="preserve">Servidores y Despliegue: </w:t>
-      </w:r>
-      <w:proofErr w:type="spellStart"/>
-      <w:r>
-        <w:t>Netlify</w:t>
-      </w:r>
-      <w:proofErr w:type="spellEnd"/>
-      <w:r>
-        <w:t xml:space="preserve">, </w:t>
-      </w:r>
-      <w:proofErr w:type="spellStart"/>
-      <w:r>
-        <w:t>Vercel</w:t>
-      </w:r>
-      <w:proofErr w:type="spellEnd"/>
-      <w:r>
-        <w:t xml:space="preserve">, </w:t>
-      </w:r>
-      <w:proofErr w:type="spellStart"/>
-      <w:r>
-        <w:t>Firebase</w:t>
-      </w:r>
-      <w:proofErr w:type="spellEnd"/>
-      <w:r>
-        <w:t xml:space="preserve"> Hosting, Google Cloud </w:t>
-      </w:r>
-      <w:proofErr w:type="spellStart"/>
-      <w:r>
-        <w:t>Platform</w:t>
-      </w:r>
-      <w:proofErr w:type="spellEnd"/>
-      <w:r>
-        <w:t xml:space="preserve">. </w:t>
+        <w:t xml:space="preserve">Servidores y Despliegue: Netlify, Vercel, Firebase Hosting, Google Cloud Platform. </w:t>
       </w:r>
     </w:p>
     <w:p>
@@ -2734,14 +1600,7 @@
           <w:rFonts w:eastAsia="Times New Roman"/>
           <w:szCs w:val="22"/>
         </w:rPr>
-        <w:t>LinkedIn:</w:t>
-      </w:r>
-      <w:r>
-        <w:rPr>
-          <w:rFonts w:eastAsia="Times New Roman"/>
-          <w:szCs w:val="22"/>
-        </w:rPr>
-        <w:t xml:space="preserve"> </w:t>
+        <w:t xml:space="preserve">LinkedIn: </w:t>
       </w:r>
       <w:hyperlink r:id="rId17" w:history="1">
         <w:r>

</xml_diff>

<commit_message>
Update CV with current experience, Ayni, Goyo Motors, and new certificates
Co-Authored-By: Claude Sonnet 5 <noreply@anthropic.com>
</commit_message>
<xml_diff>
--- a/Edward Pittman - CV.docx
+++ b/Edward Pittman - CV.docx
@@ -23,24 +23,7 @@
         <w:jc w:val="center"/>
       </w:pPr>
       <w:r>
-        <w:t xml:space="preserve">Lima, Peru · </w:t>
-      </w:r>
-      <w:hyperlink r:id="rId7">
-        <w:r>
-          <w:rPr>
-            <w:color w:val="1155CC"/>
-            <w:u w:val="single" w:color="1155CC"/>
-          </w:rPr>
-          <w:t>linkedin.com/in/edward</w:t>
-        </w:r>
-      </w:hyperlink>
-      <w:hyperlink r:id="rId8">
-        <w:r>
-          <w:t xml:space="preserve"> </w:t>
-        </w:r>
-      </w:hyperlink>
-      <w:r>
-        <w:t>· +51 907377938 · epittman341@gmail.com</w:t>
+        <w:t xml:space="preserve">Lima, Peru · +51 907377938 · epittman341@gmail.com</w:t>
       </w:r>
       <w:r>
         <w:rPr>
@@ -148,7 +131,7 @@
           <w:color w:val="0E0E0E"/>
           <w:szCs w:val="28"/>
         </w:rPr>
-        <w:t>Estudiante de Ingeniería de Software con enfoque en desarrollo Front-End y Back-End. Cuento con experiencia práctica creando soluciones web y de software, combinando lógica, diseño y eficiencia. Me destaco por mi capacidad para resolver problemas, trabajar en equipo y llevar proyectos de principio a fin con responsabilidad y proactividad.</w:t>
+        <w:t>Desarrollador Full Stack con experiencia en producción, diseño de bases de datos y desarrollo de sistemas de gestión, aplicaciones móviles empresariales y herramientas de automatización. Llevo los proyectos de principio a fin, desde la arquitectura hasta el despliegue, con foco en soluciones que realmente se usan.</w:t>
       </w:r>
       <w:r>
         <w:rPr>
@@ -316,16 +299,9 @@
       </w:pPr>
       <w:r>
         <w:rPr>
-          <w:b/>
-          <w:szCs w:val="22"/>
-        </w:rPr>
-        <w:t xml:space="preserve">Sitio web corporativo: </w:t>
-      </w:r>
-      <w:r>
-        <w:rPr>
-          <w:szCs w:val="22"/>
-        </w:rPr>
-        <w:t xml:space="preserve">catálogo interactivo de 37 planes de Fibra Óptica FTTH/HFC (1Play/2Play/3Play) para Claro, con carrusel, galería de equipo, formulario de contacto comercial y bolsa de trabajo con postulación; construido con Astro, TypeScript y View Transitions. </w:t>
+          <w:szCs w:val="22"/>
+        </w:rPr>
+        <w:t xml:space="preserve">Fundé, junto al equipo inicial, el área de Sistemas de la empresa. Diseñé y construí la arquitectura de base de datos. </w:t>
       </w:r>
     </w:p>
     <w:p>
@@ -344,13 +320,13 @@
           <w:b/>
           <w:szCs w:val="22"/>
         </w:rPr>
-        <w:t xml:space="preserve">App móvil empresarial: </w:t>
-      </w:r>
-      <w:r>
-        <w:rPr>
-          <w:szCs w:val="22"/>
-        </w:rPr>
-        <w:t xml:space="preserve">sistema con 6 roles y permisos granulares por módulo; ventas, instalaciones, almacén (stock, entregas, checklists) y auditorías con firma digital SVG y reportes en PDF; asistencia con reconocimiento facial. Backend en Supabase (PostgreSQL, RLS, 30+ tablas) con Expo/React Native y TypeScript. </w:t>
+        <w:t xml:space="preserve">Sitio web corporativo: </w:t>
+      </w:r>
+      <w:r>
+        <w:rPr>
+          <w:szCs w:val="22"/>
+        </w:rPr>
+        <w:t xml:space="preserve">landing page de Nova Smart (Distribuidor Autorizado Claro) pensada para exponer la empresa ante el público: presentación institucional, catálogo completo de productos y servicios de Fibra Óptica FTTH/HFC, canal de ventas, coordinación de instalaciones, bolsa de trabajo para reclutamiento y promoción general de la marca; construido con Astro y TypeScript. </w:t>
       </w:r>
     </w:p>
     <w:p>
@@ -369,13 +345,13 @@
           <w:b/>
           <w:szCs w:val="22"/>
         </w:rPr>
-        <w:t xml:space="preserve">Bandeja de WhatsApp: </w:t>
-      </w:r>
-      <w:r>
-        <w:rPr>
-          <w:szCs w:val="22"/>
-        </w:rPr>
-        <w:t xml:space="preserve">panel con dashboard de métricas, chat en tiempo real y editor de plantillas, conectado a Supabase Edge Functions. </w:t>
+        <w:t xml:space="preserve">App móvil empresarial: </w:t>
+      </w:r>
+      <w:r>
+        <w:rPr>
+          <w:szCs w:val="22"/>
+        </w:rPr>
+        <w:t xml:space="preserve">sistema con roles y permisos granulares por módulo y área; gestión de ventas, instalaciones, almacén (stock, entregas, checklists) y auditorías con firma digital, caja, control de mantenimiento de la flota vehicular de la empresa, rastreo de productos, gestión de usuarios y áreas, y asistencia con reconocimiento facial inteligente. Construida con Expo/React Native y TypeScript. </w:t>
       </w:r>
     </w:p>
     <w:p>
@@ -394,13 +370,13 @@
           <w:b/>
           <w:szCs w:val="22"/>
         </w:rPr>
-        <w:t xml:space="preserve">Automatización de WhatsApp: </w:t>
-      </w:r>
-      <w:r>
-        <w:rPr>
-          <w:szCs w:val="22"/>
-        </w:rPr>
-        <w:t xml:space="preserve">bot construido sobre la API de Meta (WhatsApp Business Cloud API) con Python y TypeScript para agilizar la atención al cliente. </w:t>
+        <w:t xml:space="preserve">Bandeja de WhatsApp: </w:t>
+      </w:r>
+      <w:r>
+        <w:rPr>
+          <w:szCs w:val="22"/>
+        </w:rPr>
+        <w:t xml:space="preserve">panel de atención al cliente con dashboard de métricas de conversaciones y mensajes, bandeja de chat en tiempo real (texto, imágenes, audio, documentos) y editor de plantillas para actualizar los mensajes del bot sin tocar código. </w:t>
       </w:r>
     </w:p>
     <w:p>
@@ -419,13 +395,38 @@
           <w:b/>
           <w:szCs w:val="22"/>
         </w:rPr>
+        <w:t xml:space="preserve">Automatización de WhatsApp: </w:t>
+      </w:r>
+      <w:r>
+        <w:rPr>
+          <w:szCs w:val="22"/>
+        </w:rPr>
+        <w:t xml:space="preserve">bot construido sobre la API de Meta (WhatsApp Business Cloud API) con Python y TypeScript, que agiliza la atención y el flujo de mensajes de la empresa con respuestas automáticas. </w:t>
+      </w:r>
+    </w:p>
+    <w:p>
+      <w:pPr>
+        <w:numPr>
+          <w:ilvl w:val="0"/>
+          <w:numId w:val="1"/>
+        </w:numPr>
+        <w:ind w:right="842" w:hanging="360"/>
+        <w:rPr>
+          <w:szCs w:val="22"/>
+        </w:rPr>
+      </w:pPr>
+      <w:r>
+        <w:rPr>
+          <w:b/>
+          <w:szCs w:val="22"/>
+        </w:rPr>
         <w:t xml:space="preserve">WhatsApp Line Extractor: </w:t>
       </w:r>
       <w:r>
         <w:rPr>
           <w:szCs w:val="22"/>
         </w:rPr>
-        <w:t xml:space="preserve">extensión de Chrome con OCR (Tesseract.js) para agilizar una tarea operativa diaria. </w:t>
+        <w:t xml:space="preserve">extensión de Chrome que detecta las fotos abiertas en WhatsApp Web y aplica OCR (Tesseract.js) para leer y copiar automáticamente el número de línea al portapapeles, con historial de las últimas 100 lecturas. </w:t>
       </w:r>
     </w:p>
     <w:p>
@@ -454,7 +455,7 @@
           <w:b/>
           <w:szCs w:val="22"/>
         </w:rPr>
-        <w:t xml:space="preserve">HERRAMIENTA DE AUTOMATIZACIÓN CLI PARA GIT &amp; GITHUB </w:t>
+        <w:t xml:space="preserve">AYNI.PE </w:t>
         <w:tab/>
         <w:t xml:space="preserve">Lima, Perú</w:t>
       </w:r>
@@ -482,7 +483,7 @@
         <w:rPr>
           <w:szCs w:val="22"/>
         </w:rPr>
-        <w:t xml:space="preserve">Desarrollador FullStack </w:t>
+        <w:t xml:space="preserve">Desarrollador FullStack Mobile </w:t>
         <w:tab/>
       </w:r>
       <w:r>
@@ -491,7 +492,7 @@
           <w:iCs/>
           <w:szCs w:val="22"/>
         </w:rPr>
-        <w:t xml:space="preserve">Abril 2026</w:t>
+        <w:t xml:space="preserve">Junio 2026</w:t>
       </w:r>
     </w:p>
     <w:p>
@@ -510,7 +511,7 @@
         <w:rPr>
           <w:szCs w:val="22"/>
         </w:rPr>
-        <w:t xml:space="preserve">Diseñé una CLI multiplataforma en Node.js que automatiza el ciclo de vida de repositorios Git (init, commits, push) e integra la API/CLI de GitHub para autenticación y despliegue en un solo paso. </w:t>
+        <w:t xml:space="preserve">Desarrollé un marketplace tipo Uber que conecta clientes con profesionales y freelancers verificados cerca de su ubicación, con doble modo cliente/profesional y verificación de prestadores de servicio. </w:t>
       </w:r>
     </w:p>
     <w:p>
@@ -528,7 +529,7 @@
         <w:rPr>
           <w:szCs w:val="22"/>
         </w:rPr>
-        <w:t xml:space="preserve">Configuré alias de doble comando (bin de npm) para flujos rápidos de actualización (quick-push); publicado como paquete npm. </w:t>
+        <w:t xml:space="preserve">Implementé geolocalización en tiempo real con Expo/React Native, TypeScript y Firebase; proyecto presentado en la feria comercial de la carrera de Administración de la UNTELS. </w:t>
       </w:r>
     </w:p>
     <w:p>
@@ -678,7 +679,7 @@
           <w:b/>
           <w:szCs w:val="22"/>
         </w:rPr>
-        <w:t xml:space="preserve">SERVIREPUESTOS GOYO </w:t>
+        <w:t xml:space="preserve">GOYO MOTORS </w:t>
         <w:tab/>
         <w:t xml:space="preserve">Lima, Perú</w:t>
       </w:r>
@@ -734,7 +735,7 @@
         <w:rPr>
           <w:szCs w:val="22"/>
         </w:rPr>
-        <w:t xml:space="preserve">Lideré la digitalización de SERVIREPUESTOS GOYO, diseñando desde cero un ERP multi-sucursal con Next.js y Firebase (Firestore independiente por sede). </w:t>
+        <w:t xml:space="preserve">Lideré la digitalización de GOYO MOTORS, diseñando desde cero un ERP multi-sucursal con Next.js y Firebase (Firestore independiente por sede). </w:t>
       </w:r>
     </w:p>
     <w:p>
@@ -752,7 +753,7 @@
         <w:rPr>
           <w:szCs w:val="22"/>
         </w:rPr>
-        <w:t xml:space="preserve">Implementé el módulo de inventario con control de stock por lotes bajo lógica FIFO y transacciones atómicas, garantizando trazabilidad de costos y precios de compra/venta. </w:t>
+        <w:t xml:space="preserve">Desarrollé los módulos de productos, inventario, lotes (control FIFO), ingresos, ventas, cotizaciones, créditos y devoluciones. </w:t>
       </w:r>
     </w:p>
     <w:p>
@@ -770,7 +771,7 @@
         <w:rPr>
           <w:szCs w:val="22"/>
         </w:rPr>
-        <w:t xml:space="preserve">Desarrollé los módulos de ventas, cotizaciones, créditos (incluido crédito acumulativo) y devoluciones, con generación de PDFs, exportación a Excel y un dashboard analítico con Recharts. </w:t>
+        <w:t xml:space="preserve">Construí los módulos de clientes, proveedores, empleados, caja y auditoría, con generación de PDFs, exportación a Excel y un dashboard analítico con Recharts. </w:t>
       </w:r>
     </w:p>
     <w:p>
@@ -799,7 +800,7 @@
           <w:b/>
           <w:szCs w:val="22"/>
         </w:rPr>
-        <w:t xml:space="preserve">RESCUEMAL </w:t>
+        <w:t xml:space="preserve">HERRAMIENTA DE AUTOMATIZACIÓN CLI PARA GIT &amp; GITHUB </w:t>
         <w:tab/>
         <w:t xml:space="preserve">Lima, Perú</w:t>
       </w:r>
@@ -827,7 +828,7 @@
         <w:rPr>
           <w:szCs w:val="22"/>
         </w:rPr>
-        <w:t xml:space="preserve">Desarrollador FullStack Mobile </w:t>
+        <w:t xml:space="preserve">Desarrollador FullStack </w:t>
         <w:tab/>
       </w:r>
       <w:r>
@@ -836,7 +837,7 @@
           <w:iCs/>
           <w:szCs w:val="22"/>
         </w:rPr>
-        <w:t xml:space="preserve">Septiembre – Diciembre 2025</w:t>
+        <w:t xml:space="preserve">Abril 2026</w:t>
       </w:r>
     </w:p>
     <w:p>
@@ -855,7 +856,7 @@
         <w:rPr>
           <w:szCs w:val="22"/>
         </w:rPr>
-        <w:t xml:space="preserve">Desarrollé una app móvil nativa (Kotlin/Java) para el rescate de animales en situación de calle, alineada a los ODS. </w:t>
+        <w:t xml:space="preserve">Diseñé una CLI multiplataforma en Node.js que automatiza el ciclo de vida de repositorios Git (init, commits, push) e integra la API/CLI de GitHub para autenticación y despliegue en un solo paso. </w:t>
       </w:r>
     </w:p>
     <w:p>
@@ -873,25 +874,7 @@
         <w:rPr>
           <w:szCs w:val="22"/>
         </w:rPr>
-        <w:t xml:space="preserve">Integré Google Maps Platform para geolocalizar reportes y trazar rutas de rescate. </w:t>
-      </w:r>
-    </w:p>
-    <w:p>
-      <w:pPr>
-        <w:numPr>
-          <w:ilvl w:val="0"/>
-          <w:numId w:val="1"/>
-        </w:numPr>
-        <w:ind w:right="842" w:hanging="360"/>
-        <w:rPr>
-          <w:szCs w:val="22"/>
-        </w:rPr>
-      </w:pPr>
-      <w:r>
-        <w:rPr>
-          <w:szCs w:val="22"/>
-        </w:rPr>
-        <w:t xml:space="preserve">Gestioné la infraestructura en Firebase (Firestore y Storage) para sincronizar reportes y evidencias en tiempo real. </w:t>
+        <w:t xml:space="preserve">Configuré alias de doble comando (bin de npm) para flujos rápidos de actualización (quick-push); publicado como paquete npm. </w:t>
       </w:r>
     </w:p>
     <w:p>
@@ -920,7 +903,7 @@
           <w:b/>
           <w:szCs w:val="22"/>
         </w:rPr>
-        <w:t xml:space="preserve">L'ELIXIR - CATÁLOGO VIRTUAL </w:t>
+        <w:t xml:space="preserve">RESCUEMAL </w:t>
         <w:tab/>
         <w:t xml:space="preserve">Lima, Perú</w:t>
       </w:r>
@@ -948,7 +931,7 @@
         <w:rPr>
           <w:szCs w:val="22"/>
         </w:rPr>
-        <w:t xml:space="preserve">Desarrollador FrontEnd </w:t>
+        <w:t xml:space="preserve">Desarrollador FullStack Mobile </w:t>
         <w:tab/>
       </w:r>
       <w:r>
@@ -957,7 +940,7 @@
           <w:iCs/>
           <w:szCs w:val="22"/>
         </w:rPr>
-        <w:t xml:space="preserve">2025</w:t>
+        <w:t xml:space="preserve">Septiembre – Diciembre 2025</w:t>
       </w:r>
     </w:p>
     <w:p>
@@ -976,7 +959,7 @@
         <w:rPr>
           <w:szCs w:val="22"/>
         </w:rPr>
-        <w:t xml:space="preserve">Desarrollé un catálogo virtual publicitario para la venta de perfumes, orientado a conversión. </w:t>
+        <w:t xml:space="preserve">Desarrollé una app móvil nativa (Kotlin/Java) para el rescate de animales en situación de calle, alineada a los ODS. </w:t>
       </w:r>
     </w:p>
     <w:p>
@@ -994,17 +977,129 @@
         <w:rPr>
           <w:szCs w:val="22"/>
         </w:rPr>
+        <w:t xml:space="preserve">Integré Google Maps Platform para geolocalizar reportes y trazar rutas de rescate. </w:t>
+      </w:r>
+    </w:p>
+    <w:p>
+      <w:pPr>
+        <w:numPr>
+          <w:ilvl w:val="0"/>
+          <w:numId w:val="1"/>
+        </w:numPr>
+        <w:ind w:right="842" w:hanging="360"/>
+        <w:rPr>
+          <w:szCs w:val="22"/>
+        </w:rPr>
+      </w:pPr>
+      <w:r>
+        <w:rPr>
+          <w:szCs w:val="22"/>
+        </w:rPr>
+        <w:t xml:space="preserve">Gestioné la infraestructura en Firebase (Firestore y Storage) para sincronizar reportes y evidencias en tiempo real. </w:t>
+      </w:r>
+    </w:p>
+    <w:p>
+      <w:pPr>
+        <w:spacing w:after="0" w:line="259" w:lineRule="auto"/>
+        <w:ind w:right="0"/>
+        <w:rPr>
+          <w:szCs w:val="22"/>
+        </w:rPr>
+      </w:pPr>
+    </w:p>
+    <w:p>
+      <w:pPr>
+        <w:keepNext/>
+        <w:tabs>
+          <w:tab w:val="right" w:pos="11198"/>
+        </w:tabs>
+        <w:spacing w:after="1" w:line="258" w:lineRule="auto"/>
+        <w:ind w:left="0" w:right="0" w:firstLine="0"/>
+        <w:rPr>
+          <w:szCs w:val="22"/>
+        </w:rPr>
+      </w:pPr>
+      <w:r>
+        <w:rPr>
+          <w:b/>
+          <w:szCs w:val="22"/>
+        </w:rPr>
+        <w:t xml:space="preserve">L'ELIXIR - CATÁLOGO VIRTUAL </w:t>
+        <w:tab/>
+        <w:t xml:space="preserve">Lima, Perú</w:t>
+      </w:r>
+      <w:r>
+        <w:rPr>
+          <w:i/>
+          <w:szCs w:val="22"/>
+        </w:rPr>
+        <w:t xml:space="preserve"> </w:t>
+      </w:r>
+    </w:p>
+    <w:p>
+      <w:pPr>
+        <w:keepNext/>
+        <w:tabs>
+          <w:tab w:val="right" w:pos="11198"/>
+        </w:tabs>
+        <w:spacing w:after="113"/>
+        <w:ind w:left="0" w:right="0" w:firstLine="0"/>
+        <w:rPr>
+          <w:szCs w:val="22"/>
+        </w:rPr>
+      </w:pPr>
+      <w:r>
+        <w:rPr>
+          <w:szCs w:val="22"/>
+        </w:rPr>
+        <w:t xml:space="preserve">Desarrollador FrontEnd </w:t>
+        <w:tab/>
+      </w:r>
+      <w:r>
+        <w:rPr>
+          <w:i/>
+          <w:iCs/>
+          <w:szCs w:val="22"/>
+        </w:rPr>
+        <w:t xml:space="preserve">2025</w:t>
+      </w:r>
+    </w:p>
+    <w:p>
+      <w:pPr>
+        <w:keepLines/>
+        <w:numPr>
+          <w:ilvl w:val="0"/>
+          <w:numId w:val="1"/>
+        </w:numPr>
+        <w:ind w:right="842" w:hanging="360"/>
+        <w:rPr>
+          <w:szCs w:val="22"/>
+        </w:rPr>
+      </w:pPr>
+      <w:r>
+        <w:rPr>
+          <w:szCs w:val="22"/>
+        </w:rPr>
+        <w:t xml:space="preserve">Desarrollé un catálogo virtual publicitario para la venta de perfumes, orientado a conversión. </w:t>
+      </w:r>
+    </w:p>
+    <w:p>
+      <w:pPr>
+        <w:numPr>
+          <w:ilvl w:val="0"/>
+          <w:numId w:val="1"/>
+        </w:numPr>
+        <w:ind w:right="842" w:hanging="360"/>
+        <w:rPr>
+          <w:szCs w:val="22"/>
+        </w:rPr>
+      </w:pPr>
+      <w:r>
+        <w:rPr>
+          <w:szCs w:val="22"/>
+        </w:rPr>
         <w:t xml:space="preserve">Construí el sitio con Astro para lograr una carga rápida y una experiencia de navegación ligera. </w:t>
       </w:r>
-    </w:p>
-    <w:p>
-      <w:pPr>
-        <w:spacing w:after="120" w:line="259" w:lineRule="auto"/>
-        <w:ind w:right="0"/>
-        <w:rPr>
-          <w:szCs w:val="22"/>
-        </w:rPr>
-      </w:pPr>
     </w:p>
     <w:p>
       <w:pPr>
@@ -1305,6 +1400,87 @@
     </w:p>
     <w:p>
       <w:pPr>
+        <w:spacing w:after="0" w:line="259" w:lineRule="auto"/>
+        <w:ind w:left="108" w:right="0" w:firstLine="0"/>
+      </w:pPr>
+      <w:r>
+        <w:t xml:space="preserve"> </w:t>
+      </w:r>
+    </w:p>
+    <w:p>
+      <w:pPr>
+        <w:spacing w:after="4" w:line="251" w:lineRule="auto"/>
+        <w:ind w:left="103" w:right="0" w:hanging="10"/>
+      </w:pPr>
+      <w:r>
+        <w:t xml:space="preserve">EXCELENCIA AUTÓNOMA - COMPETENCIA 1: AUTOGESTIÓN Y BIENESTAR PROFESIONAL -&gt;  </w:t>
+      </w:r>
+      <w:hyperlink r:id="rId22">
+        <w:r>
+          <w:rPr>
+            <w:color w:val="0563C1"/>
+            <w:u w:val="single" w:color="0563C1"/>
+          </w:rPr>
+          <w:t>https://virtual.autonoma.edu.pe/ConstanciasRA/W20260722205181B6D.pdf</w:t>
+        </w:r>
+      </w:hyperlink>
+    </w:p>
+    <w:p>
+      <w:pPr>
+        <w:spacing w:after="0" w:line="259" w:lineRule="auto"/>
+        <w:ind w:left="108" w:right="0" w:firstLine="0"/>
+      </w:pPr>
+      <w:r>
+        <w:t xml:space="preserve"> </w:t>
+      </w:r>
+    </w:p>
+    <w:p>
+      <w:pPr>
+        <w:spacing w:after="4" w:line="251" w:lineRule="auto"/>
+        <w:ind w:left="103" w:right="0" w:hanging="10"/>
+      </w:pPr>
+      <w:r>
+        <w:t xml:space="preserve">EXCELENCIA AUTÓNOMA - COMPETENCIA 2: PENSAMIENTO CRÍTICO E INNOVACIÓN -&gt;  </w:t>
+      </w:r>
+      <w:hyperlink r:id="rId23">
+        <w:r>
+          <w:rPr>
+            <w:color w:val="0563C1"/>
+            <w:u w:val="single" w:color="0563C1"/>
+          </w:rPr>
+          <w:t>https://virtual.autonoma.edu.pe/ConstanciasRA/W2026072310511DC1B.pdf</w:t>
+        </w:r>
+      </w:hyperlink>
+    </w:p>
+    <w:p>
+      <w:pPr>
+        <w:spacing w:after="0" w:line="259" w:lineRule="auto"/>
+        <w:ind w:left="108" w:right="0" w:firstLine="0"/>
+      </w:pPr>
+      <w:r>
+        <w:t xml:space="preserve"> </w:t>
+      </w:r>
+    </w:p>
+    <w:p>
+      <w:pPr>
+        <w:spacing w:after="4" w:line="251" w:lineRule="auto"/>
+        <w:ind w:left="103" w:right="0" w:hanging="10"/>
+      </w:pPr>
+      <w:r>
+        <w:t xml:space="preserve">FINALISTA DEL AUTÓNOMA CHALLENGE 2026 -&gt;  </w:t>
+      </w:r>
+      <w:hyperlink r:id="rId24">
+        <w:r>
+          <w:rPr>
+            <w:color w:val="0563C1"/>
+            <w:u w:val="single" w:color="0563C1"/>
+          </w:rPr>
+          <w:t>https://virtual.autonoma.edu.pe/ConstanciasRA/W20260719133149728.pdf</w:t>
+        </w:r>
+      </w:hyperlink>
+    </w:p>
+    <w:p>
+      <w:pPr>
         <w:spacing w:after="141" w:line="259" w:lineRule="auto"/>
         <w:ind w:left="108" w:right="0" w:firstLine="0"/>
       </w:pPr>
@@ -1675,29 +1851,6 @@
           <w:t>ige.vercel.app/</w:t>
         </w:r>
       </w:hyperlink>
-    </w:p>
-    <w:p>
-      <w:pPr>
-        <w:spacing w:after="1209" w:line="259" w:lineRule="auto"/>
-        <w:ind w:left="108" w:right="0" w:firstLine="0"/>
-        <w:jc w:val="left"/>
-      </w:pPr>
-      <w:r>
-        <w:rPr>
-          <w:sz w:val="20"/>
-        </w:rPr>
-        <w:t xml:space="preserve"> </w:t>
-      </w:r>
-    </w:p>
-    <w:p>
-      <w:pPr>
-        <w:spacing w:after="359" w:line="259" w:lineRule="auto"/>
-        <w:ind w:left="1136" w:right="0" w:firstLine="0"/>
-        <w:jc w:val="left"/>
-      </w:pPr>
-      <w:r>
-        <w:t xml:space="preserve"> </w:t>
-      </w:r>
     </w:p>
     <w:sectPr>
       <w:pgSz w:w="12240" w:h="15840"/>

</xml_diff>